<commit_message>
docs(lab2): use natural experiment narrative
</commit_message>
<xml_diff>
--- a/report/member-b/实验二_乙_最终版.docx
+++ b/report/member-b/实验二_乙_最终版.docx
@@ -631,7 +631,7 @@
           <w:rFonts w:ascii="Times New Roman" w:hAnsi="Times New Roman" w:eastAsia="宋体"/>
           <w:sz w:val="22"/>
         </w:rPr>
-        <w:t xml:space="preserve">补充验证：本轮在 VS Code 集成终端执行干净构建，日志以 BUILD_EXIT=0 结束。该图仅补充编译证据，原有 Best-Fit 源码说明和图片均保留。</w:t>
+        <w:t xml:space="preserve">进入集成工程目录后，先执行 make clean 清理旧构建结果，再执行 make 完成内核编译。终端显示 BUILD_EXIT=0，说明编译成功。</w:t>
       </w:r>
     </w:p>
     <w:p>
@@ -897,7 +897,7 @@
           <w:rFonts w:ascii="Times New Roman" w:hAnsi="Times New Roman" w:eastAsia="宋体"/>
           <w:sz w:val="22"/>
         </w:rPr>
-        <w:t xml:space="preserve">补充验证：本轮在 VS Code 集成终端通过 RISC-V GDB 命中 best_fit_alloc_pages(n=1)，调用栈可回溯到 basic_check()、best_fit_check()、pmm_init() 与 kern_init()，退出码为 0。</w:t>
+        <w:t xml:space="preserve">在 VS Code 集成终端启动 RISC-V GDB，并在 best_fit_alloc_pages(n=1) 处断点。通过 bt 可回溯到 basic_check()、best_fit_check()、pmm_init() 与 kern_init()；调试正常结束，退出码为 0。</w:t>
       </w:r>
     </w:p>
     <w:p>
@@ -2520,7 +2520,7 @@
           <w:rFonts w:ascii="Times New Roman" w:hAnsi="Times New Roman" w:eastAsia="宋体"/>
           <w:sz w:val="22"/>
         </w:rPr>
-        <w:t xml:space="preserve">补充验证：GDB 先确认 1025 字节申请返回 NULL，再确认 8 字节申请返回有效且 16 字节对齐的对象；内存耗尽测试清理后记录 pages_exhausted=1、objects_exhausted=1、pages_restored=1。</w:t>
+        <w:t xml:space="preserve">在 GDB 中先申请 1025 字节对象，返回 NULL；再申请 8 字节对象，返回有效且 16 字节对齐的地址。内存耗尽测试完成清理后，记录 pages_exhausted=1、objects_exhausted=1、pages_restored=1。</w:t>
       </w:r>
     </w:p>
     <w:p>
@@ -2656,7 +2656,7 @@
           <w:rFonts w:ascii="Times New Roman" w:hAnsi="Times New Roman" w:eastAsia="宋体"/>
           <w:sz w:val="22"/>
         </w:rPr>
-        <w:t xml:space="preserve">补充验证：本轮 VS Code QEMU 串口出现 memory management: best_fit_pmm_manager、check_alloc_page() succeeded! 和 slub_check() succeeded!；脚本检测标记后受控发送 SIGINT，QEMU_CHECK_EXIT=0。</w:t>
+        <w:t xml:space="preserve">执行 make qemu 启动内核。串口输出 memory management: best_fit_pmm_manager、check_alloc_page() succeeded! 和 slub_check() succeeded!；脚本检测到这些标记后受控发送 SIGINT，QEMU_CHECK_EXIT=0。</w:t>
       </w:r>
     </w:p>
     <w:p>
@@ -2733,7 +2733,7 @@
           <w:rFonts w:ascii="Times New Roman" w:hAnsi="Times New Roman" w:eastAsia="宋体"/>
           <w:sz w:val="22"/>
         </w:rPr>
-        <w:t xml:space="preserve">补充验证：在同一集成工程中执行 make grade，终端显示 Total Score: 20/20，GRADE_EXIT=0。</w:t>
+        <w:t xml:space="preserve">在同一集成工程中执行 make grade，终端显示 Total Score: 20/20，GRADE_EXIT=0。</w:t>
       </w:r>
     </w:p>
     <w:p>
@@ -2798,7 +2798,7 @@
           <w:rFonts w:ascii="Times New Roman" w:hAnsi="Times New Roman" w:eastAsia="宋体"/>
           <w:sz w:val="22"/>
         </w:rPr>
-        <w:t xml:space="preserve">补充验证：执行 tools/check_a.py --qemu 后，Page Init 与 Buddy 的 64、128、256 页测试均通过，五个预期 panic 均被观测，CHECK_A_EXIT=0。</w:t>
+        <w:t xml:space="preserve">执行 tools/check_a.py --qemu 后，Page Init 与 Buddy 的 64、128、256 页测试均通过，五个预期 panic 均被观测，CHECK_A_EXIT=0。</w:t>
       </w:r>
     </w:p>
     <w:p>

</xml_diff>

<commit_message>
docs(lab2): describe every member b screenshot
</commit_message>
<xml_diff>
--- a/report/member-b/实验二_乙_最终版.docx
+++ b/report/member-b/实验二_乙_最终版.docx
@@ -645,6 +645,19 @@
     </w:p>
     <w:p>
       <w:pPr>
+        <w:spacing w:before="0" w:after="80"/>
+      </w:pPr>
+      <w:r>
+        <w:rPr>
+          <w:rFonts w:ascii="宋体" w:hAnsi="宋体" w:eastAsia="宋体"/>
+          <w:sz w:val="21"/>
+          <w:szCs w:val="21"/>
+        </w:rPr>
+        <w:t>图 1：终端单独编译 Best-Fit 物理页分配器源码。用于检查 best_fit_pmm.c 的接口、头文件引用和 RISC-V 交叉编译结果均正常。</w:t>
+      </w:r>
+    </w:p>
+    <w:p>
+      <w:pPr>
         <w:rPr>
           <w:rFonts w:hint="default"/>
           <w:lang w:val="en-US" w:eastAsia="zh-CN"/>
@@ -1146,6 +1159,19 @@
     </w:p>
     <w:p>
       <w:pPr>
+        <w:spacing w:before="0" w:after="80"/>
+      </w:pPr>
+      <w:r>
+        <w:rPr>
+          <w:rFonts w:ascii="宋体" w:hAnsi="宋体" w:eastAsia="宋体"/>
+          <w:sz w:val="21"/>
+          <w:szCs w:val="21"/>
+        </w:rPr>
+        <w:t>图 2：终端单独编译 SLUB 分配器及初始化调用相关源码。用于检查 slub.c、slub.h 与内核初始化接口能够正确衔接。</w:t>
+      </w:r>
+    </w:p>
+    <w:p>
+      <w:pPr>
         <w:rPr>
           <w:rFonts w:hint="eastAsia"/>
           <w:b/>
@@ -1619,6 +1645,19 @@
     </w:p>
     <w:p>
       <w:pPr>
+        <w:spacing w:before="0" w:after="80"/>
+      </w:pPr>
+      <w:r>
+        <w:rPr>
+          <w:rFonts w:ascii="宋体" w:hAnsi="宋体" w:eastAsia="宋体"/>
+          <w:sz w:val="21"/>
+          <w:szCs w:val="21"/>
+        </w:rPr>
+        <w:t>图 3：终端单独编译 SLUB 测试模块。用于检查 slub_test.c 对分配器接口的调用、断言依赖和编译链接关系正确。</w:t>
+      </w:r>
+    </w:p>
+    <w:p>
+      <w:pPr>
         <w:pStyle w:val="2"/>
         <w:keepNext w:val="0"/>
         <w:keepLines w:val="0"/>
@@ -2876,6 +2915,19 @@
     </w:p>
     <w:p>
       <w:pPr>
+        <w:spacing w:before="0" w:after="80"/>
+      </w:pPr>
+      <w:r>
+        <w:rPr>
+          <w:rFonts w:ascii="宋体" w:hAnsi="宋体" w:eastAsia="宋体"/>
+          <w:sz w:val="21"/>
+          <w:szCs w:val="21"/>
+        </w:rPr>
+        <w:t>图 4：再次单独构建 slub_test.o 测试模块。用于确认 SLUB 测试文件可独立通过编译，且未引入新的依赖错误。</w:t>
+      </w:r>
+    </w:p>
+    <w:p>
+      <w:pPr>
         <w:pStyle w:val="2"/>
         <w:keepNext w:val="0"/>
         <w:keepLines w:val="0"/>
@@ -2929,6 +2981,19 @@
     </w:p>
     <w:p>
       <w:pPr>
+        <w:spacing w:before="0" w:after="80"/>
+      </w:pPr>
+      <w:r>
+        <w:rPr>
+          <w:rFonts w:ascii="宋体" w:hAnsi="宋体" w:eastAsia="宋体"/>
+          <w:sz w:val="21"/>
+          <w:szCs w:val="21"/>
+        </w:rPr>
+        <w:t>图 5：查看 pmm.c 的 init_pmm_manager()、page_init() 位置并检查 Git 状态。用于确认物理页管理器注册与 page_init 调用位置，同时核对工作区。</w:t>
+      </w:r>
+    </w:p>
+    <w:p>
+      <w:pPr>
         <w:pStyle w:val="2"/>
         <w:keepNext w:val="0"/>
         <w:keepLines w:val="0"/>
@@ -2982,6 +3047,19 @@
     </w:p>
     <w:p>
       <w:pPr>
+        <w:spacing w:before="0" w:after="80"/>
+      </w:pPr>
+      <w:r>
+        <w:rPr>
+          <w:rFonts w:ascii="宋体" w:hAnsi="宋体" w:eastAsia="宋体"/>
+          <w:sz w:val="21"/>
+          <w:szCs w:val="21"/>
+        </w:rPr>
+        <w:t>图 6：查看 pmm.c 中 page_init 的 YOUR CODE 区域和 pmm_init() 流程。用于确认 page_init 已接入物理页管理初始化并保留实验标记。</w:t>
+      </w:r>
+    </w:p>
+    <w:p>
+      <w:pPr>
         <w:pStyle w:val="2"/>
         <w:keepNext w:val="0"/>
         <w:keepLines w:val="0"/>
@@ -3038,6 +3116,19 @@
     </w:p>
     <w:p>
       <w:pPr>
+        <w:spacing w:before="0" w:after="80"/>
+      </w:pPr>
+      <w:r>
+        <w:rPr>
+          <w:rFonts w:ascii="宋体" w:hAnsi="宋体" w:eastAsia="宋体"/>
+          <w:sz w:val="21"/>
+          <w:szCs w:val="21"/>
+        </w:rPr>
+        <w:t>图 7：查看集成工程中的文件状态。用于复核新增测试、调试记录和实验报告材料没有遗漏。</w:t>
+      </w:r>
+    </w:p>
+    <w:p>
+      <w:pPr>
         <w:pStyle w:val="2"/>
         <w:keepNext w:val="0"/>
         <w:keepLines w:val="0"/>
@@ -3091,6 +3182,19 @@
     </w:p>
     <w:p>
       <w:pPr>
+        <w:spacing w:before="0" w:after="80"/>
+      </w:pPr>
+      <w:r>
+        <w:rPr>
+          <w:rFonts w:ascii="宋体" w:hAnsi="宋体" w:eastAsia="宋体"/>
+          <w:sz w:val="21"/>
+          <w:szCs w:val="21"/>
+        </w:rPr>
+        <w:t>图 8：查看 Git 状态的后续输出。用于确认本次实验不包含对评分脚本和无关文件的意外修改。</w:t>
+      </w:r>
+    </w:p>
+    <w:p>
+      <w:pPr>
         <w:pStyle w:val="2"/>
         <w:keepNext w:val="0"/>
         <w:keepLines w:val="0"/>
@@ -3144,6 +3248,19 @@
     </w:p>
     <w:p>
       <w:pPr>
+        <w:spacing w:before="0" w:after="80"/>
+      </w:pPr>
+      <w:r>
+        <w:rPr>
+          <w:rFonts w:ascii="宋体" w:hAnsi="宋体" w:eastAsia="宋体"/>
+          <w:sz w:val="21"/>
+          <w:szCs w:val="21"/>
+        </w:rPr>
+        <w:t>图 9：查看工程文件与版本控制记录。用于为后续构建、运行和提交前的文件一致性检查提供依据。</w:t>
+      </w:r>
+    </w:p>
+    <w:p>
+      <w:pPr>
         <w:pStyle w:val="2"/>
         <w:keepNext w:val="0"/>
         <w:keepLines w:val="0"/>
@@ -3197,6 +3314,19 @@
     </w:p>
     <w:p>
       <w:pPr>
+        <w:spacing w:before="0" w:after="80"/>
+      </w:pPr>
+      <w:r>
+        <w:rPr>
+          <w:rFonts w:ascii="宋体" w:hAnsi="宋体" w:eastAsia="宋体"/>
+          <w:sz w:val="21"/>
+          <w:szCs w:val="21"/>
+        </w:rPr>
+        <w:t>图 10：执行 clean 后的完整内核构建。用于验证 Best-Fit、SLUB、Buddy 等模块能够随工程一起通过编译。</w:t>
+      </w:r>
+    </w:p>
+    <w:p>
+      <w:pPr>
         <w:pStyle w:val="2"/>
         <w:keepNext w:val="0"/>
         <w:keepLines w:val="0"/>
@@ -3250,6 +3380,19 @@
     </w:p>
     <w:p>
       <w:pPr>
+        <w:spacing w:before="0" w:after="80"/>
+      </w:pPr>
+      <w:r>
+        <w:rPr>
+          <w:rFonts w:ascii="宋体" w:hAnsi="宋体" w:eastAsia="宋体"/>
+          <w:sz w:val="21"/>
+          <w:szCs w:val="21"/>
+        </w:rPr>
+        <w:t>图 11：执行 make qemu 后的内核启动日志。用于检查 OpenSBI 启动、物理页管理器初始化和 SLUB 自检过程能够正常完成。</w:t>
+      </w:r>
+    </w:p>
+    <w:p>
+      <w:pPr>
         <w:pStyle w:val="2"/>
         <w:keepNext w:val="0"/>
         <w:keepLines w:val="0"/>
@@ -3303,6 +3446,19 @@
     </w:p>
     <w:p>
       <w:pPr>
+        <w:spacing w:before="0" w:after="80"/>
+      </w:pPr>
+      <w:r>
+        <w:rPr>
+          <w:rFonts w:ascii="宋体" w:hAnsi="宋体" w:eastAsia="宋体"/>
+          <w:sz w:val="21"/>
+          <w:szCs w:val="21"/>
+        </w:rPr>
+        <w:t>图 12：执行 make grade 的评分输出。用于验证 Page Init 与 Best-Fit 的基础检查通过，并记录评分结果。</w:t>
+      </w:r>
+    </w:p>
+    <w:p>
+      <w:pPr>
         <w:pStyle w:val="2"/>
         <w:keepNext w:val="0"/>
         <w:keepLines w:val="0"/>
@@ -3387,6 +3543,19 @@
     </w:p>
     <w:p>
       <w:pPr>
+        <w:spacing w:before="0" w:after="80"/>
+      </w:pPr>
+      <w:r>
+        <w:rPr>
+          <w:rFonts w:ascii="宋体" w:hAnsi="宋体" w:eastAsia="宋体"/>
+          <w:sz w:val="21"/>
+          <w:szCs w:val="21"/>
+        </w:rPr>
+        <w:t>图 13：构建包含调试信息的内核镜像。用于为 QEMU 和 GDB 联合调试准备带符号的可执行文件。</w:t>
+      </w:r>
+    </w:p>
+    <w:p>
+      <w:pPr>
         <w:pStyle w:val="2"/>
         <w:keepNext w:val="0"/>
         <w:keepLines w:val="0"/>
@@ -3440,6 +3609,19 @@
     </w:p>
     <w:p>
       <w:pPr>
+        <w:spacing w:before="0" w:after="80"/>
+      </w:pPr>
+      <w:r>
+        <w:rPr>
+          <w:rFonts w:ascii="宋体" w:hAnsi="宋体" w:eastAsia="宋体"/>
+          <w:sz w:val="21"/>
+          <w:szCs w:val="21"/>
+        </w:rPr>
+        <w:t>图 14：查看 VS Code 转发的 1234 调试端口。用于确认 QEMU 的远程 GDB 端口已经处于可连接状态。</w:t>
+      </w:r>
+    </w:p>
+    <w:p>
+      <w:pPr>
         <w:pStyle w:val="2"/>
         <w:keepNext w:val="0"/>
         <w:keepLines w:val="0"/>
@@ -3493,6 +3675,19 @@
     </w:p>
     <w:p>
       <w:pPr>
+        <w:spacing w:before="0" w:after="80"/>
+      </w:pPr>
+      <w:r>
+        <w:rPr>
+          <w:rFonts w:ascii="宋体" w:hAnsi="宋体" w:eastAsia="宋体"/>
+          <w:sz w:val="21"/>
+          <w:szCs w:val="21"/>
+        </w:rPr>
+        <w:t>图 15：RISC-V GDB 连接 localhost:1234 的输出。用于验证宿主机调试器可以附加到 QEMU 中运行的内核。</w:t>
+      </w:r>
+    </w:p>
+    <w:p>
+      <w:pPr>
         <w:pStyle w:val="2"/>
         <w:keepNext w:val="0"/>
         <w:keepLines w:val="0"/>
@@ -3546,6 +3741,19 @@
     </w:p>
     <w:p>
       <w:pPr>
+        <w:spacing w:before="0" w:after="80"/>
+      </w:pPr>
+      <w:r>
+        <w:rPr>
+          <w:rFonts w:ascii="宋体" w:hAnsi="宋体" w:eastAsia="宋体"/>
+          <w:sz w:val="21"/>
+          <w:szCs w:val="21"/>
+        </w:rPr>
+        <w:t>图 16：在 kern_init() 设置并命中断点。用于确认内核入口位置可被稳定调试和单步观察。</w:t>
+      </w:r>
+    </w:p>
+    <w:p>
+      <w:pPr>
         <w:pStyle w:val="2"/>
         <w:keepNext w:val="0"/>
         <w:keepLines w:val="0"/>
@@ -3599,6 +3807,19 @@
     </w:p>
     <w:p>
       <w:pPr>
+        <w:spacing w:before="0" w:after="80"/>
+      </w:pPr>
+      <w:r>
+        <w:rPr>
+          <w:rFonts w:ascii="宋体" w:hAnsi="宋体" w:eastAsia="宋体"/>
+          <w:sz w:val="21"/>
+          <w:szCs w:val="21"/>
+        </w:rPr>
+        <w:t>图 17：再次显示调试版内核构建过程。用于确认调试会话使用的是带符号信息且与当前源码一致的镜像。</w:t>
+      </w:r>
+    </w:p>
+    <w:p>
+      <w:pPr>
         <w:pStyle w:val="2"/>
         <w:keepNext w:val="0"/>
         <w:keepLines w:val="0"/>
@@ -3652,6 +3873,19 @@
     </w:p>
     <w:p>
       <w:pPr>
+        <w:spacing w:before="0" w:after="80"/>
+      </w:pPr>
+      <w:r>
+        <w:rPr>
+          <w:rFonts w:ascii="宋体" w:hAnsi="宋体" w:eastAsia="宋体"/>
+          <w:sz w:val="21"/>
+          <w:szCs w:val="21"/>
+        </w:rPr>
+        <w:t>图 18：在 GDB 中读取 PC、satp、反汇编和调用栈。用于确认当前执行位置以及 Sv39 页表寄存器状态。</w:t>
+      </w:r>
+    </w:p>
+    <w:p>
+      <w:pPr>
         <w:pStyle w:val="2"/>
         <w:keepNext w:val="0"/>
         <w:keepLines w:val="0"/>
@@ -3705,6 +3939,19 @@
     </w:p>
     <w:p>
       <w:pPr>
+        <w:spacing w:before="0" w:after="80"/>
+      </w:pPr>
+      <w:r>
+        <w:rPr>
+          <w:rFonts w:ascii="宋体" w:hAnsi="宋体" w:eastAsia="宋体"/>
+          <w:sz w:val="21"/>
+          <w:szCs w:val="21"/>
+        </w:rPr>
+        <w:t>图 19：在 pmm_init() 设置并命中断点。用于验证物理内存管理初始化由内核启动流程正确调用。</w:t>
+      </w:r>
+    </w:p>
+    <w:p>
+      <w:pPr>
         <w:pStyle w:val="2"/>
         <w:keepNext w:val="0"/>
         <w:keepLines w:val="0"/>
@@ -3762,6 +4009,19 @@
     </w:p>
     <w:p>
       <w:pPr>
+        <w:spacing w:before="0" w:after="80"/>
+      </w:pPr>
+      <w:r>
+        <w:rPr>
+          <w:rFonts w:ascii="宋体" w:hAnsi="宋体" w:eastAsia="宋体"/>
+          <w:sz w:val="21"/>
+          <w:szCs w:val="21"/>
+        </w:rPr>
+        <w:t>图 20：QEMU 启动阶段的串口输出。用于记录设备树提供的内存范围以及内核进入物理页管理初始化前的状态。</w:t>
+      </w:r>
+    </w:p>
+    <w:p>
+      <w:pPr>
         <w:pStyle w:val="2"/>
         <w:keepNext w:val="0"/>
         <w:keepLines w:val="0"/>
@@ -3815,6 +4075,19 @@
     </w:p>
     <w:p>
       <w:pPr>
+        <w:spacing w:before="0" w:after="80"/>
+      </w:pPr>
+      <w:r>
+        <w:rPr>
+          <w:rFonts w:ascii="宋体" w:hAnsi="宋体" w:eastAsia="宋体"/>
+          <w:sz w:val="21"/>
+          <w:szCs w:val="21"/>
+        </w:rPr>
+        <w:t>图 21：查看 pmm_init() 附近的寄存器、调用栈和源码。用于核对 page_init 前后的初始化顺序。</w:t>
+      </w:r>
+    </w:p>
+    <w:p>
+      <w:pPr>
         <w:pStyle w:val="2"/>
         <w:keepNext w:val="0"/>
         <w:keepLines w:val="0"/>
@@ -3868,6 +4141,19 @@
     </w:p>
     <w:p>
       <w:pPr>
+        <w:spacing w:before="0" w:after="80"/>
+      </w:pPr>
+      <w:r>
+        <w:rPr>
+          <w:rFonts w:ascii="宋体" w:hAnsi="宋体" w:eastAsia="宋体"/>
+          <w:sz w:val="21"/>
+          <w:szCs w:val="21"/>
+        </w:rPr>
+        <w:t>图 22：命中 Best-Fit 页面分配函数的断点。用于验证基础检查实际进入了 Best-Fit 分配路径。</w:t>
+      </w:r>
+    </w:p>
+    <w:p>
+      <w:pPr>
         <w:pStyle w:val="2"/>
         <w:keepNext w:val="0"/>
         <w:keepLines w:val="0"/>
@@ -3921,6 +4207,19 @@
     </w:p>
     <w:p>
       <w:pPr>
+        <w:spacing w:before="0" w:after="80"/>
+      </w:pPr>
+      <w:r>
+        <w:rPr>
+          <w:rFonts w:ascii="宋体" w:hAnsi="宋体" w:eastAsia="宋体"/>
+          <w:sz w:val="21"/>
+          <w:szCs w:val="21"/>
+        </w:rPr>
+        <w:t>图 23：查看 Best-Fit 分配器运行时的 QEMU 输出。用于确认当前普通实验配置使用了 Best-Fit 管理器。</w:t>
+      </w:r>
+    </w:p>
+    <w:p>
+      <w:pPr>
         <w:pStyle w:val="2"/>
         <w:keepNext w:val="0"/>
         <w:keepLines w:val="0"/>
@@ -3974,6 +4273,19 @@
     </w:p>
     <w:p>
       <w:pPr>
+        <w:spacing w:before="0" w:after="80"/>
+      </w:pPr>
+      <w:r>
+        <w:rPr>
+          <w:rFonts w:ascii="宋体" w:hAnsi="宋体" w:eastAsia="宋体"/>
+          <w:sz w:val="21"/>
+          <w:szCs w:val="21"/>
+        </w:rPr>
+        <w:t>图 24：查看 Best-Fit 分配函数的调用栈。用于核对 basic_check()、best_fit_check() 和 pmm_init() 的调用关系。</w:t>
+      </w:r>
+    </w:p>
+    <w:p>
+      <w:pPr>
         <w:pStyle w:val="2"/>
         <w:keepNext w:val="0"/>
         <w:keepLines w:val="0"/>
@@ -4027,6 +4339,19 @@
     </w:p>
     <w:p>
       <w:pPr>
+        <w:spacing w:before="0" w:after="80"/>
+      </w:pPr>
+      <w:r>
+        <w:rPr>
+          <w:rFonts w:ascii="宋体" w:hAnsi="宋体" w:eastAsia="宋体"/>
+          <w:sz w:val="21"/>
+          <w:szCs w:val="21"/>
+        </w:rPr>
+        <w:t>图 25：查看 Best-Fit 分配与释放的源码位置。用于检查最小空闲块选择、块拆分、相邻块合并和链表维护逻辑。</w:t>
+      </w:r>
+    </w:p>
+    <w:p>
+      <w:pPr>
         <w:pStyle w:val="2"/>
         <w:keepNext w:val="0"/>
         <w:keepLines w:val="0"/>
@@ -4080,6 +4405,19 @@
     </w:p>
     <w:p>
       <w:pPr>
+        <w:spacing w:before="0" w:after="80"/>
+      </w:pPr>
+      <w:r>
+        <w:rPr>
+          <w:rFonts w:ascii="宋体" w:hAnsi="宋体" w:eastAsia="宋体"/>
+          <w:sz w:val="21"/>
+          <w:szCs w:val="21"/>
+        </w:rPr>
+        <w:t>图 26：在 slub_alloc() 的零大小申请分支处调试。用于验证 size 为 0 时分配器按约定返回 NULL。</w:t>
+      </w:r>
+    </w:p>
+    <w:p>
+      <w:pPr>
         <w:pStyle w:val="2"/>
         <w:keepNext w:val="0"/>
         <w:keepLines w:val="0"/>
@@ -4133,6 +4471,19 @@
     </w:p>
     <w:p>
       <w:pPr>
+        <w:spacing w:before="0" w:after="80"/>
+      </w:pPr>
+      <w:r>
+        <w:rPr>
+          <w:rFonts w:ascii="宋体" w:hAnsi="宋体" w:eastAsia="宋体"/>
+          <w:sz w:val="21"/>
+          <w:szCs w:val="21"/>
+        </w:rPr>
+        <w:t>图 27：查看 SLUB 测试运行期间的 QEMU 输出。用于确认对象分配测试已随内核启动流程被调用。</w:t>
+      </w:r>
+    </w:p>
+    <w:p>
+      <w:pPr>
         <w:pStyle w:val="2"/>
         <w:keepNext w:val="0"/>
         <w:keepLines w:val="0"/>
@@ -4186,6 +4537,19 @@
     </w:p>
     <w:p>
       <w:pPr>
+        <w:spacing w:before="0" w:after="80"/>
+      </w:pPr>
+      <w:r>
+        <w:rPr>
+          <w:rFonts w:ascii="宋体" w:hAnsi="宋体" w:eastAsia="宋体"/>
+          <w:sz w:val="21"/>
+          <w:szCs w:val="21"/>
+        </w:rPr>
+        <w:t>图 28：在 slub_alloc() 的超范围申请分支处调试。用于验证超过支持上限的对象大小会被拒绝。</w:t>
+      </w:r>
+    </w:p>
+    <w:p>
+      <w:pPr>
         <w:pStyle w:val="2"/>
         <w:keepNext w:val="0"/>
         <w:keepLines w:val="0"/>
@@ -4239,6 +4603,19 @@
     </w:p>
     <w:p>
       <w:pPr>
+        <w:spacing w:before="0" w:after="80"/>
+      </w:pPr>
+      <w:r>
+        <w:rPr>
+          <w:rFonts w:ascii="宋体" w:hAnsi="宋体" w:eastAsia="宋体"/>
+          <w:sz w:val="21"/>
+          <w:szCs w:val="21"/>
+        </w:rPr>
+        <w:t>图 29：查看超范围请求的调用栈和源码。用于确认该边界条件由 slub_test 调用并沿正确分支返回。</w:t>
+      </w:r>
+    </w:p>
+    <w:p>
+      <w:pPr>
         <w:pStyle w:val="2"/>
         <w:keepNext w:val="0"/>
         <w:keepLines w:val="0"/>
@@ -4292,6 +4669,19 @@
     </w:p>
     <w:p>
       <w:pPr>
+        <w:spacing w:before="0" w:after="80"/>
+      </w:pPr>
+      <w:r>
+        <w:rPr>
+          <w:rFonts w:ascii="宋体" w:hAnsi="宋体" w:eastAsia="宋体"/>
+          <w:sz w:val="21"/>
+          <w:szCs w:val="21"/>
+        </w:rPr>
+        <w:t>图 30：在 slub_alloc() 中查看 size=1025 的参数、调用栈及实现代码。用于验证超范围请求通过 slub_find_cache() 找不到匹配缓存后返回 NULL。</w:t>
+      </w:r>
+    </w:p>
+    <w:p>
+      <w:pPr>
         <w:pStyle w:val="2"/>
         <w:keepNext w:val="0"/>
         <w:keepLines w:val="0"/>
@@ -4345,6 +4735,19 @@
     </w:p>
     <w:p>
       <w:pPr>
+        <w:spacing w:before="0" w:after="80"/>
+      </w:pPr>
+      <w:r>
+        <w:rPr>
+          <w:rFonts w:ascii="宋体" w:hAnsi="宋体" w:eastAsia="宋体"/>
+          <w:sz w:val="21"/>
+          <w:szCs w:val="21"/>
+        </w:rPr>
+        <w:t>图 31：结束 size=1025 的 slub_alloc() 调用并查看返回值。用于验证超出 1024 字节上限时返回 NULL。</w:t>
+      </w:r>
+    </w:p>
+    <w:p>
+      <w:pPr>
         <w:pStyle w:val="2"/>
         <w:keepNext w:val="0"/>
         <w:keepLines w:val="0"/>
@@ -4398,6 +4801,19 @@
     </w:p>
     <w:p>
       <w:pPr>
+        <w:spacing w:before="0" w:after="80"/>
+      </w:pPr>
+      <w:r>
+        <w:rPr>
+          <w:rFonts w:ascii="宋体" w:hAnsi="宋体" w:eastAsia="宋体"/>
+          <w:sz w:val="21"/>
+          <w:szCs w:val="21"/>
+        </w:rPr>
+        <w:t>图 32：在 size=8 时再次命中 slub_alloc()，断点条件限制为 0&lt;size&lt;=1024。用于验证有效对象可进入正常分配分支。</w:t>
+      </w:r>
+    </w:p>
+    <w:p>
+      <w:pPr>
         <w:pStyle w:val="2"/>
         <w:keepNext w:val="0"/>
         <w:keepLines w:val="0"/>
@@ -4451,6 +4867,19 @@
     </w:p>
     <w:p>
       <w:pPr>
+        <w:spacing w:before="0" w:after="80"/>
+      </w:pPr>
+      <w:r>
+        <w:rPr>
+          <w:rFonts w:ascii="宋体" w:hAnsi="宋体" w:eastAsia="宋体"/>
+          <w:sz w:val="21"/>
+          <w:szCs w:val="21"/>
+        </w:rPr>
+        <w:t>图 33：查看 size=8 的调用栈和 slub_alloc() 实现。用于检查 slub_find_cache()、slub_new_slab() 和空闲链表取对象的正常分配路径。</w:t>
+      </w:r>
+    </w:p>
+    <w:p>
+      <w:pPr>
         <w:pStyle w:val="2"/>
         <w:keepNext w:val="0"/>
         <w:keepLines w:val="0"/>
@@ -4504,6 +4933,19 @@
     </w:p>
     <w:p>
       <w:pPr>
+        <w:spacing w:before="0" w:after="80"/>
+      </w:pPr>
+      <w:r>
+        <w:rPr>
+          <w:rFonts w:ascii="宋体" w:hAnsi="宋体" w:eastAsia="宋体"/>
+          <w:sz w:val="21"/>
+          <w:szCs w:val="21"/>
+        </w:rPr>
+        <w:t>图 34：禁用临时断点并继续执行。用于让边界检查后的 SLUB 测试继续运行，避免调试断点干扰完成状态。</w:t>
+      </w:r>
+    </w:p>
+    <w:p>
+      <w:pPr>
         <w:pStyle w:val="2"/>
         <w:keepNext w:val="0"/>
         <w:keepLines w:val="0"/>
@@ -4557,6 +4999,19 @@
     </w:p>
     <w:p>
       <w:pPr>
+        <w:spacing w:before="0" w:after="80"/>
+      </w:pPr>
+      <w:r>
+        <w:rPr>
+          <w:rFonts w:ascii="宋体" w:hAnsi="宋体" w:eastAsia="宋体"/>
+          <w:sz w:val="21"/>
+          <w:szCs w:val="21"/>
+        </w:rPr>
+        <w:t>图 35：QEMU 串口显示 slub_check() succeeded!。用于验证 SLUB 分配、释放和页回收的自检通过。</w:t>
+      </w:r>
+    </w:p>
+    <w:p>
+      <w:pPr>
         <w:pStyle w:val="2"/>
         <w:keepNext w:val="0"/>
         <w:keepLines w:val="0"/>
@@ -4640,6 +5095,19 @@
     </w:p>
     <w:p>
       <w:pPr>
+        <w:spacing w:before="0" w:after="80"/>
+      </w:pPr>
+      <w:r>
+        <w:rPr>
+          <w:rFonts w:ascii="宋体" w:hAnsi="宋体" w:eastAsia="宋体"/>
+          <w:sz w:val="21"/>
+          <w:szCs w:val="21"/>
+        </w:rPr>
+        <w:t>图 36：启动宿主机 GDB 并为 QEMU 的 riscv_cpu_tlb_fill() 和 get_physical_address() 设置断点。用于进入 TLB 地址翻译调试。</w:t>
+      </w:r>
+    </w:p>
+    <w:p>
+      <w:pPr>
         <w:pStyle w:val="2"/>
         <w:keepNext w:val="0"/>
         <w:keepLines w:val="0"/>
@@ -4693,6 +5161,19 @@
     </w:p>
     <w:p>
       <w:pPr>
+        <w:spacing w:before="0" w:after="80"/>
+      </w:pPr>
+      <w:r>
+        <w:rPr>
+          <w:rFonts w:ascii="宋体" w:hAnsi="宋体" w:eastAsia="宋体"/>
+          <w:sz w:val="21"/>
+          <w:szCs w:val="21"/>
+        </w:rPr>
+        <w:t>图 37：尝试以 RISC-V GDB 连接来宾调试端口时的协议报错。用于记录远程包错误现象，并与后续宿主机 QEMU 调试方案区分。</w:t>
+      </w:r>
+    </w:p>
+    <w:p>
+      <w:pPr>
         <w:pStyle w:val="2"/>
         <w:keepNext w:val="0"/>
         <w:keepLines w:val="0"/>
@@ -4746,6 +5227,19 @@
     </w:p>
     <w:p>
       <w:pPr>
+        <w:spacing w:before="0" w:after="80"/>
+      </w:pPr>
+      <w:r>
+        <w:rPr>
+          <w:rFonts w:ascii="宋体" w:hAnsi="宋体" w:eastAsia="宋体"/>
+          <w:sz w:val="21"/>
+          <w:szCs w:val="21"/>
+        </w:rPr>
+        <w:t>图 38：在 GDB 中配置 QEMU 启动参数和 TLB 断点时的命令输出。用于记录参数格式错误并为后续正确的 -s -S 启动方式做排查。</w:t>
+      </w:r>
+    </w:p>
+    <w:p>
+      <w:pPr>
         <w:pStyle w:val="2"/>
         <w:keepNext w:val="0"/>
         <w:keepLines w:val="0"/>
@@ -4799,6 +5293,19 @@
     </w:p>
     <w:p>
       <w:pPr>
+        <w:spacing w:before="0" w:after="80"/>
+      </w:pPr>
+      <w:r>
+        <w:rPr>
+          <w:rFonts w:ascii="宋体" w:hAnsi="宋体" w:eastAsia="宋体"/>
+          <w:sz w:val="21"/>
+          <w:szCs w:val="21"/>
+        </w:rPr>
+        <w:t>图 39：在 RISC-V GDB 中尝试通过 set args 配置 QEMU 参数与 TLB 断点。用于记录“on/off expected”的参数格式错误，说明该步骤需要改用宿主机命令启动 QEMU。</w:t>
+      </w:r>
+    </w:p>
+    <w:p>
+      <w:pPr>
         <w:pStyle w:val="2"/>
         <w:keepNext w:val="0"/>
         <w:keepLines w:val="0"/>
@@ -4856,6 +5363,19 @@
     </w:p>
     <w:p>
       <w:pPr>
+        <w:spacing w:before="0" w:after="80"/>
+      </w:pPr>
+      <w:r>
+        <w:rPr>
+          <w:rFonts w:ascii="宋体" w:hAnsi="宋体" w:eastAsia="宋体"/>
+          <w:sz w:val="21"/>
+          <w:szCs w:val="21"/>
+        </w:rPr>
+        <w:t>图 40：在宿主机命令行使用 qemu-system-riscv64 的 -s -S 参数启动 QEMU。用于让模拟器暂停并开放远程调试端口。</w:t>
+      </w:r>
+    </w:p>
+    <w:p>
+      <w:pPr>
         <w:pStyle w:val="2"/>
         <w:keepNext w:val="0"/>
         <w:keepLines w:val="0"/>
@@ -4909,6 +5429,19 @@
     </w:p>
     <w:p>
       <w:pPr>
+        <w:spacing w:before="0" w:after="80"/>
+      </w:pPr>
+      <w:r>
+        <w:rPr>
+          <w:rFonts w:ascii="宋体" w:hAnsi="宋体" w:eastAsia="宋体"/>
+          <w:sz w:val="21"/>
+          <w:szCs w:val="21"/>
+        </w:rPr>
+        <w:t>图 41：检查 qemu-system-riscv64 进程及 TCP 1234 监听状态。用于确认 QEMU 已运行且 GDB 端口可用。</w:t>
+      </w:r>
+    </w:p>
+    <w:p>
+      <w:pPr>
         <w:pStyle w:val="2"/>
         <w:keepNext w:val="0"/>
         <w:keepLines w:val="0"/>
@@ -4962,6 +5495,19 @@
     </w:p>
     <w:p>
       <w:pPr>
+        <w:spacing w:before="0" w:after="80"/>
+      </w:pPr>
+      <w:r>
+        <w:rPr>
+          <w:rFonts w:ascii="宋体" w:hAnsi="宋体" w:eastAsia="宋体"/>
+          <w:sz w:val="21"/>
+          <w:szCs w:val="21"/>
+        </w:rPr>
+        <w:t>图 42：查看 VS Code Ports 面板转发 1234 端口。用于确认本机调试端口已暴露到编辑器连接通道。</w:t>
+      </w:r>
+    </w:p>
+    <w:p>
+      <w:pPr>
         <w:pStyle w:val="2"/>
         <w:keepNext w:val="0"/>
         <w:keepLines w:val="0"/>
@@ -5015,6 +5561,19 @@
     </w:p>
     <w:p>
       <w:pPr>
+        <w:spacing w:before="0" w:after="80"/>
+      </w:pPr>
+      <w:r>
+        <w:rPr>
+          <w:rFonts w:ascii="宋体" w:hAnsi="宋体" w:eastAsia="宋体"/>
+          <w:sz w:val="21"/>
+          <w:szCs w:val="21"/>
+        </w:rPr>
+        <w:t>图 43：宿主机 GDB 附加到 qemu-system-riscv64 进程。用于观察 QEMU 内部 RISC-V TLB 处理函数的执行位置。</w:t>
+      </w:r>
+    </w:p>
+    <w:p>
+      <w:pPr>
         <w:pStyle w:val="2"/>
         <w:keepNext w:val="0"/>
         <w:keepLines w:val="0"/>
@@ -5068,6 +5627,19 @@
     </w:p>
     <w:p>
       <w:pPr>
+        <w:spacing w:before="0" w:after="80"/>
+      </w:pPr>
+      <w:r>
+        <w:rPr>
+          <w:rFonts w:ascii="宋体" w:hAnsi="宋体" w:eastAsia="宋体"/>
+          <w:sz w:val="21"/>
+          <w:szCs w:val="21"/>
+        </w:rPr>
+        <w:t>图 44：RISC-V GDB 连接内核、设置 kern_init() 断点并命中。用于建立来宾内核地址转换调试的起始状态。</w:t>
+      </w:r>
+    </w:p>
+    <w:p>
+      <w:pPr>
         <w:pStyle w:val="2"/>
         <w:keepNext w:val="0"/>
         <w:keepLines w:val="0"/>
@@ -5121,6 +5693,19 @@
     </w:p>
     <w:p>
       <w:pPr>
+        <w:spacing w:before="0" w:after="80"/>
+      </w:pPr>
+      <w:r>
+        <w:rPr>
+          <w:rFonts w:ascii="宋体" w:hAnsi="宋体" w:eastAsia="宋体"/>
+          <w:sz w:val="21"/>
+          <w:szCs w:val="21"/>
+        </w:rPr>
+        <w:t>图 45：在 kern_init() 处读取 PC 与 satp。用于记录 Sv39 地址转换开始时的内核入口地址和页表根寄存器。</w:t>
+      </w:r>
+    </w:p>
+    <w:p>
+      <w:pPr>
         <w:pStyle w:val="2"/>
         <w:keepNext w:val="0"/>
         <w:keepLines w:val="0"/>
@@ -5174,6 +5759,19 @@
     </w:p>
     <w:p>
       <w:pPr>
+        <w:spacing w:before="0" w:after="80"/>
+      </w:pPr>
+      <w:r>
+        <w:rPr>
+          <w:rFonts w:ascii="宋体" w:hAnsi="宋体" w:eastAsia="宋体"/>
+          <w:sz w:val="21"/>
+          <w:szCs w:val="21"/>
+        </w:rPr>
+        <w:t>图 46：QEMU 以 -s -S 启动后的串口输出。用于观察调试会话恢复执行时的固件和内核启动状态。</w:t>
+      </w:r>
+    </w:p>
+    <w:p>
+      <w:pPr>
         <w:pStyle w:val="2"/>
         <w:keepNext w:val="0"/>
         <w:keepLines w:val="0"/>
@@ -5227,6 +5825,19 @@
     </w:p>
     <w:p>
       <w:pPr>
+        <w:spacing w:before="0" w:after="80"/>
+      </w:pPr>
+      <w:r>
+        <w:rPr>
+          <w:rFonts w:ascii="宋体" w:hAnsi="宋体" w:eastAsia="宋体"/>
+          <w:sz w:val="21"/>
+          <w:szCs w:val="21"/>
+        </w:rPr>
+        <w:t>图 47：在宿主机 GDB 中继续执行、接收 SIGINT 并设置 TLB 相关断点。用于准备跟踪 get_physical_address() 的地址翻译过程。</w:t>
+      </w:r>
+    </w:p>
+    <w:p>
+      <w:pPr>
         <w:pStyle w:val="2"/>
         <w:keepNext w:val="0"/>
         <w:keepLines w:val="0"/>
@@ -5280,6 +5891,19 @@
     </w:p>
     <w:p>
       <w:pPr>
+        <w:spacing w:before="0" w:after="80"/>
+      </w:pPr>
+      <w:r>
+        <w:rPr>
+          <w:rFonts w:ascii="宋体" w:hAnsi="宋体" w:eastAsia="宋体"/>
+          <w:sz w:val="21"/>
+          <w:szCs w:val="21"/>
+        </w:rPr>
+        <w:t>图 48：在来宾 GDB 中继续执行。用于触发后续内存访问并等待 TLB 相关断点命中。</w:t>
+      </w:r>
+    </w:p>
+    <w:p>
+      <w:pPr>
         <w:pStyle w:val="2"/>
         <w:keepNext w:val="0"/>
         <w:keepLines w:val="0"/>
@@ -5333,6 +5957,19 @@
     </w:p>
     <w:p>
       <w:pPr>
+        <w:spacing w:before="0" w:after="80"/>
+      </w:pPr>
+      <w:r>
+        <w:rPr>
+          <w:rFonts w:ascii="宋体" w:hAnsi="宋体" w:eastAsia="宋体"/>
+          <w:sz w:val="21"/>
+          <w:szCs w:val="21"/>
+        </w:rPr>
+        <w:t>图 49：运行中断后停在 kern_init()。用于记录来宾停止位置，确认可由 GDB 控制内核执行。</w:t>
+      </w:r>
+    </w:p>
+    <w:p>
+      <w:pPr>
         <w:pStyle w:val="2"/>
         <w:keepNext w:val="0"/>
         <w:keepLines w:val="0"/>
@@ -5386,6 +6023,19 @@
     </w:p>
     <w:p>
       <w:pPr>
+        <w:spacing w:before="0" w:after="80"/>
+      </w:pPr>
+      <w:r>
+        <w:rPr>
+          <w:rFonts w:ascii="宋体" w:hAnsi="宋体" w:eastAsia="宋体"/>
+          <w:sz w:val="21"/>
+          <w:szCs w:val="21"/>
+        </w:rPr>
+        <w:t>图 50：宿主机 GDB 命中 QEMU 的 get_physical_address() 断点。用于确认来宾访问触发了 QEMU 的地址翻译处理。</w:t>
+      </w:r>
+    </w:p>
+    <w:p>
+      <w:pPr>
         <w:pStyle w:val="2"/>
         <w:keepNext w:val="0"/>
         <w:keepLines w:val="0"/>
@@ -5439,6 +6089,19 @@
     </w:p>
     <w:p>
       <w:pPr>
+        <w:spacing w:before="0" w:after="80"/>
+      </w:pPr>
+      <w:r>
+        <w:rPr>
+          <w:rFonts w:ascii="宋体" w:hAnsi="宋体" w:eastAsia="宋体"/>
+          <w:sz w:val="21"/>
+          <w:szCs w:val="21"/>
+        </w:rPr>
+        <w:t>图 51：查看 get_physical_address() 的参数、局部信息和调用栈。用于记录虚拟地址、访问类型及 QEMU 翻译函数的调用上下文。</w:t>
+      </w:r>
+    </w:p>
+    <w:p>
+      <w:pPr>
         <w:pStyle w:val="2"/>
         <w:keepNext w:val="0"/>
         <w:keepLines w:val="0"/>
@@ -5492,6 +6155,19 @@
     </w:p>
     <w:p>
       <w:pPr>
+        <w:spacing w:before="0" w:after="80"/>
+      </w:pPr>
+      <w:r>
+        <w:rPr>
+          <w:rFonts w:ascii="宋体" w:hAnsi="宋体" w:eastAsia="宋体"/>
+          <w:sz w:val="21"/>
+          <w:szCs w:val="21"/>
+        </w:rPr>
+        <w:t>图 52：查看 QEMU 中 get_physical_address() 的 MMU 模式、satp 和页表层级计算源码。用于解释地址翻译前的模式选择与根页表基址计算。</w:t>
+      </w:r>
+    </w:p>
+    <w:p>
+      <w:pPr>
         <w:pStyle w:val="2"/>
         <w:keepNext w:val="0"/>
         <w:keepLines w:val="0"/>
@@ -5545,6 +6221,19 @@
     </w:p>
     <w:p>
       <w:pPr>
+        <w:spacing w:before="0" w:after="80"/>
+      </w:pPr>
+      <w:r>
+        <w:rPr>
+          <w:rFonts w:ascii="宋体" w:hAnsi="宋体" w:eastAsia="宋体"/>
+          <w:sz w:val="21"/>
+          <w:szCs w:val="21"/>
+        </w:rPr>
+        <w:t>图 53：读取 env-&gt;satp 派生的页表根地址、检查断点列表后继续执行。用于确认地址翻译观察点已经配置完成。</w:t>
+      </w:r>
+    </w:p>
+    <w:p>
+      <w:pPr>
         <w:pStyle w:val="2"/>
         <w:keepNext w:val="0"/>
         <w:keepLines w:val="0"/>
@@ -5598,6 +6287,19 @@
     </w:p>
     <w:p>
       <w:pPr>
+        <w:spacing w:before="0" w:after="80"/>
+      </w:pPr>
+      <w:r>
+        <w:rPr>
+          <w:rFonts w:ascii="宋体" w:hAnsi="宋体" w:eastAsia="宋体"/>
+          <w:sz w:val="21"/>
+          <w:szCs w:val="21"/>
+        </w:rPr>
+        <w:t>图 54：显示 riscv_cpu_tlb_fill() 命中时的目标地址和访问类型。用于记录本次 TLB 填充的实际调用参数。</w:t>
+      </w:r>
+    </w:p>
+    <w:p>
+      <w:pPr>
         <w:pStyle w:val="2"/>
         <w:keepNext w:val="0"/>
         <w:keepLines w:val="0"/>
@@ -5651,6 +6353,19 @@
     </w:p>
     <w:p>
       <w:pPr>
+        <w:spacing w:before="0" w:after="80"/>
+      </w:pPr>
+      <w:r>
+        <w:rPr>
+          <w:rFonts w:ascii="宋体" w:hAnsi="宋体" w:eastAsia="宋体"/>
+          <w:sz w:val="21"/>
+          <w:szCs w:val="21"/>
+        </w:rPr>
+        <w:t>图 55：查看 get_physical_address() 的参数与调用栈。用于记录页表遍历时的虚拟地址、访问大小和翻译上下文。</w:t>
+      </w:r>
+    </w:p>
+    <w:p>
+      <w:pPr>
         <w:pStyle w:val="2"/>
         <w:keepNext w:val="0"/>
         <w:keepLines w:val="0"/>
@@ -5704,6 +6419,19 @@
     </w:p>
     <w:p>
       <w:pPr>
+        <w:spacing w:before="0" w:after="80"/>
+      </w:pPr>
+      <w:r>
+        <w:rPr>
+          <w:rFonts w:ascii="宋体" w:hAnsi="宋体" w:eastAsia="宋体"/>
+          <w:sz w:val="21"/>
+          <w:szCs w:val="21"/>
+        </w:rPr>
+        <w:t>图 56：查看 riscv_cpu_tlb_fill() 中调用 get_physical_address()、处理返回码并调用 tlb_set_page() 的源码。用于说明 TLB 映射建立的控制流程。</w:t>
+      </w:r>
+    </w:p>
+    <w:p>
+      <w:pPr>
         <w:pStyle w:val="2"/>
         <w:keepNext w:val="0"/>
         <w:keepLines w:val="0"/>
@@ -5757,6 +6485,19 @@
     </w:p>
     <w:p>
       <w:pPr>
+        <w:spacing w:before="0" w:after="80"/>
+      </w:pPr>
+      <w:r>
+        <w:rPr>
+          <w:rFonts w:ascii="宋体" w:hAnsi="宋体" w:eastAsia="宋体"/>
+          <w:sz w:val="21"/>
+          <w:szCs w:val="21"/>
+        </w:rPr>
+        <w:t>图 57：查看 get_physical_address() 的逐级页表遍历源码，并在 PTE 地址计算处设置断点。用于观察 PTE 读取和页表步进。</w:t>
+      </w:r>
+    </w:p>
+    <w:p>
+      <w:pPr>
         <w:pStyle w:val="2"/>
         <w:keepNext w:val="0"/>
         <w:keepLines w:val="0"/>
@@ -5810,6 +6551,19 @@
     </w:p>
     <w:p>
       <w:pPr>
+        <w:spacing w:before="0" w:after="80"/>
+      </w:pPr>
+      <w:r>
+        <w:rPr>
+          <w:rFonts w:ascii="宋体" w:hAnsi="宋体" w:eastAsia="宋体"/>
+          <w:sz w:val="21"/>
+          <w:szCs w:val="21"/>
+        </w:rPr>
+        <w:t>图 58：读取页表遍历变量 i、levels、base、idx、pte_addr 和 pte。用于验证当前虚拟地址的索引计算和页表项内容。</w:t>
+      </w:r>
+    </w:p>
+    <w:p>
+      <w:pPr>
         <w:pStyle w:val="2"/>
         <w:keepNext w:val="0"/>
         <w:keepLines w:val="0"/>
@@ -5863,6 +6617,19 @@
     </w:p>
     <w:p>
       <w:pPr>
+        <w:spacing w:before="0" w:after="80"/>
+      </w:pPr>
+      <w:r>
+        <w:rPr>
+          <w:rFonts w:ascii="宋体" w:hAnsi="宋体" w:eastAsia="宋体"/>
+          <w:sz w:val="21"/>
+          <w:szCs w:val="21"/>
+        </w:rPr>
+        <w:t>图 59：检查 PTE 标志位并从 get_physical_address() 返回。用于观察一次页表翻译的中间计算结果和返回路径。</w:t>
+      </w:r>
+    </w:p>
+    <w:p>
+      <w:pPr>
         <w:pStyle w:val="2"/>
         <w:keepNext w:val="0"/>
         <w:keepLines w:val="0"/>
@@ -5916,6 +6683,19 @@
     </w:p>
     <w:p>
       <w:pPr>
+        <w:spacing w:before="0" w:after="80"/>
+      </w:pPr>
+      <w:r>
+        <w:rPr>
+          <w:rFonts w:ascii="宋体" w:hAnsi="宋体" w:eastAsia="宋体"/>
+          <w:sz w:val="21"/>
+          <w:szCs w:val="21"/>
+        </w:rPr>
+        <w:t>图 60：查看传入 tlb_set_page() 前的地址、权限和调用栈。用于核对 TLB 映射建立所使用的虚拟地址和物理地址。</w:t>
+      </w:r>
+    </w:p>
+    <w:p>
+      <w:pPr>
         <w:pStyle w:val="2"/>
         <w:keepNext w:val="0"/>
         <w:keepLines w:val="0"/>
@@ -5969,6 +6749,19 @@
     </w:p>
     <w:p>
       <w:pPr>
+        <w:spacing w:before="0" w:after="80"/>
+      </w:pPr>
+      <w:r>
+        <w:rPr>
+          <w:rFonts w:ascii="宋体" w:hAnsi="宋体" w:eastAsia="宋体"/>
+          <w:sz w:val="21"/>
+          <w:szCs w:val="21"/>
+        </w:rPr>
+        <w:t>图 61：单步进入 tlb_set_page() 并查看参数。用于检查写入 TLB 时的 vaddr、paddr、prot、mmu_idx 和 page size。</w:t>
+      </w:r>
+    </w:p>
+    <w:p>
+      <w:pPr>
         <w:pStyle w:val="2"/>
         <w:keepNext w:val="0"/>
         <w:keepLines w:val="0"/>
@@ -6022,6 +6815,19 @@
     </w:p>
     <w:p>
       <w:pPr>
+        <w:spacing w:before="0" w:after="80"/>
+      </w:pPr>
+      <w:r>
+        <w:rPr>
+          <w:rFonts w:ascii="宋体" w:hAnsi="宋体" w:eastAsia="宋体"/>
+          <w:sz w:val="21"/>
+          <w:szCs w:val="21"/>
+        </w:rPr>
+        <w:t>图 62：继续查看 tlb_set_page() 内的参数和调用关系。用于确认已得到的翻译结果被交给 QEMU TLB 子系统。</w:t>
+      </w:r>
+    </w:p>
+    <w:p>
+      <w:pPr>
         <w:pStyle w:val="2"/>
         <w:keepNext w:val="0"/>
         <w:keepLines w:val="0"/>
@@ -6078,6 +6884,19 @@
       </w:r>
       <w:bookmarkStart w:id="0" w:name="_GoBack"/>
       <w:bookmarkEnd w:id="0"/>
+    </w:p>
+    <w:p>
+      <w:pPr>
+        <w:spacing w:before="0" w:after="80"/>
+      </w:pPr>
+      <w:r>
+        <w:rPr>
+          <w:rFonts w:ascii="宋体" w:hAnsi="宋体" w:eastAsia="宋体"/>
+          <w:sz w:val="21"/>
+          <w:szCs w:val="21"/>
+        </w:rPr>
+        <w:t>图 63：从 riscv_cpu_tlb_fill() 结束当前调用并查看返回值 false。用于记录这次访问的翻译结果，避免将调试现场误判为成功映射。</w:t>
+      </w:r>
     </w:p>
     <w:sectPr>
       <w:pgSz w:w="11906" w:h="16838"/>

</xml_diff>

<commit_message>
docs(lab2): add procedural narrative for screenshots
</commit_message>
<xml_diff>
--- a/report/member-b/实验二_乙_最终版.docx
+++ b/report/member-b/实验二_乙_最终版.docx
@@ -591,6 +591,36 @@
           <w:lang w:val="en-US" w:eastAsia="zh-CN"/>
         </w:rPr>
       </w:pPr>
+    </w:p>
+    <w:p>
+      <w:pPr>
+        <w:spacing w:before="140" w:after="100"/>
+        <w:keepNext/>
+      </w:pPr>
+      <w:r>
+        <w:rPr>
+          <w:b/>
+          <w:bCs/>
+          <w:sz w:val="28"/>
+          <w:szCs w:val="28"/>
+          <w:rFonts w:ascii="宋体" w:hAnsi="宋体" w:eastAsia="宋体"/>
+        </w:rPr>
+        <w:t>一、Best-Fit 模块编译检查</w:t>
+      </w:r>
+    </w:p>
+    <w:p>
+      <w:pPr>
+        <w:spacing w:before="60" w:after="80"/>
+        <w:ind w:firstLine="420"/>
+      </w:pPr>
+      <w:r>
+        <w:rPr>
+          <w:sz w:val="21"/>
+          <w:szCs w:val="21"/>
+          <w:rFonts w:ascii="宋体" w:hAnsi="宋体" w:eastAsia="宋体"/>
+        </w:rPr>
+        <w:t>步骤 1：进入实验工程的 code 目录后，先执行 make obj/kern/mm/best_fit_pmm.o 单独编译 Best-Fit 模块。这样可在完整链接之前检查 pmm_manager 接口、链表头文件和页分配函数声明是否匹配。</w:t>
+      </w:r>
     </w:p>
     <w:p>
       <w:pPr>
@@ -1108,6 +1138,36 @@
     </w:p>
     <w:p>
       <w:pPr>
+        <w:spacing w:before="140" w:after="100"/>
+        <w:keepNext/>
+      </w:pPr>
+      <w:r>
+        <w:rPr>
+          <w:b/>
+          <w:bCs/>
+          <w:sz w:val="28"/>
+          <w:szCs w:val="28"/>
+          <w:rFonts w:ascii="宋体" w:hAnsi="宋体" w:eastAsia="宋体"/>
+        </w:rPr>
+        <w:t>二、SLUB 模块编译检查</w:t>
+      </w:r>
+    </w:p>
+    <w:p>
+      <w:pPr>
+        <w:spacing w:before="60" w:after="80"/>
+        <w:ind w:firstLine="420"/>
+      </w:pPr>
+      <w:r>
+        <w:rPr>
+          <w:sz w:val="21"/>
+          <w:szCs w:val="21"/>
+          <w:rFonts w:ascii="宋体" w:hAnsi="宋体" w:eastAsia="宋体"/>
+        </w:rPr>
+        <w:t>步骤 2：完成 Best-Fit 的单文件检查后，执行 make obj/kern/mm/slub.o 并同时观察 init.c 的依赖编译。此步骤确认 SLUB 分配器能够在 pmm_init() 之后接入内核初始化流程。</w:t>
+      </w:r>
+    </w:p>
+    <w:p>
+      <w:pPr>
         <w:rPr>
           <w:rFonts w:hint="eastAsia"/>
           <w:lang w:val="en-US" w:eastAsia="zh-CN"/>
@@ -1599,6 +1659,36 @@
       </w:r>
     </w:p>
     <w:p>
+      <w:pPr>
+        <w:spacing w:before="140" w:after="100"/>
+        <w:keepNext/>
+      </w:pPr>
+      <w:r>
+        <w:rPr>
+          <w:b/>
+          <w:bCs/>
+          <w:sz w:val="28"/>
+          <w:szCs w:val="28"/>
+          <w:rFonts w:ascii="宋体" w:hAnsi="宋体" w:eastAsia="宋体"/>
+        </w:rPr>
+        <w:t>三、SLUB 测试模块编译检查</w:t>
+      </w:r>
+    </w:p>
+    <w:p>
+      <w:pPr>
+        <w:spacing w:before="60" w:after="80"/>
+        <w:ind w:firstLine="420"/>
+      </w:pPr>
+      <w:r>
+        <w:rPr>
+          <w:sz w:val="21"/>
+          <w:szCs w:val="21"/>
+          <w:rFonts w:ascii="宋体" w:hAnsi="宋体" w:eastAsia="宋体"/>
+        </w:rPr>
+        <w:t>步骤 3：执行 make obj/kern/mm/slub_test.o，分别检查 slub_test.c、slub.c 与 init.c 的编译关系。测试模块能够独立生成目标文件，说明断言、cprintf 和 SLUB 接口的引用均已解析。</w:t>
+      </w:r>
+    </w:p>
+    <w:p>
       <w:r>
         <w:drawing>
           <wp:inline distT="0" distB="0" distL="114300" distR="114300">
@@ -2862,6 +2952,36 @@
     </w:p>
     <w:p>
       <w:pPr>
+        <w:spacing w:before="140" w:after="100"/>
+        <w:keepNext/>
+      </w:pPr>
+      <w:r>
+        <w:rPr>
+          <w:b/>
+          <w:bCs/>
+          <w:sz w:val="28"/>
+          <w:szCs w:val="28"/>
+          <w:rFonts w:ascii="宋体" w:hAnsi="宋体" w:eastAsia="宋体"/>
+        </w:rPr>
+        <w:t>四、集成工程构建、启动与评分</w:t>
+      </w:r>
+    </w:p>
+    <w:p>
+      <w:pPr>
+        <w:spacing w:before="60" w:after="80"/>
+        <w:ind w:firstLine="420"/>
+      </w:pPr>
+      <w:r>
+        <w:rPr>
+          <w:sz w:val="21"/>
+          <w:szCs w:val="21"/>
+          <w:rFonts w:ascii="宋体" w:hAnsi="宋体" w:eastAsia="宋体"/>
+        </w:rPr>
+        <w:t>步骤 4：在完整工程中再次单独构建 slub_test.o。重复检查用于确认合并其他成员模块后，SLUB 测试不会因新增依赖或头文件变化而失效。</w:t>
+      </w:r>
+    </w:p>
+    <w:p>
+      <w:pPr>
         <w:pStyle w:val="2"/>
         <w:keepNext w:val="0"/>
         <w:keepLines w:val="0"/>
@@ -2928,6 +3048,20 @@
     </w:p>
     <w:p>
       <w:pPr>
+        <w:spacing w:before="60" w:after="80"/>
+        <w:ind w:firstLine="420"/>
+      </w:pPr>
+      <w:r>
+        <w:rPr>
+          <w:sz w:val="21"/>
+          <w:szCs w:val="21"/>
+          <w:rFonts w:ascii="宋体" w:hAnsi="宋体" w:eastAsia="宋体"/>
+        </w:rPr>
+        <w:t>步骤 5：使用 grep 定位 pmm.c 中 init_pmm_manager() 和 page_init() 的实现位置，并同步查看 Git 状态。先明确物理页管理器的注册点，再检查本地集成文件是否完整。</w:t>
+      </w:r>
+    </w:p>
+    <w:p>
+      <w:pPr>
         <w:pStyle w:val="2"/>
         <w:keepNext w:val="0"/>
         <w:keepLines w:val="0"/>
@@ -2994,6 +3128,20 @@
     </w:p>
     <w:p>
       <w:pPr>
+        <w:spacing w:before="60" w:after="80"/>
+        <w:ind w:firstLine="420"/>
+      </w:pPr>
+      <w:r>
+        <w:rPr>
+          <w:sz w:val="21"/>
+          <w:szCs w:val="21"/>
+          <w:rFonts w:ascii="宋体" w:hAnsi="宋体" w:eastAsia="宋体"/>
+        </w:rPr>
+        <w:t>步骤 6：打开 pmm_init() 的初始化代码，核对 init_pmm_manager()、page_init() 与 check_alloc_page() 的顺序。该顺序保证页描述符先建立、空闲页链表随后可被分配器使用。</w:t>
+      </w:r>
+    </w:p>
+    <w:p>
+      <w:pPr>
         <w:pStyle w:val="2"/>
         <w:keepNext w:val="0"/>
         <w:keepLines w:val="0"/>
@@ -3060,6 +3208,20 @@
     </w:p>
     <w:p>
       <w:pPr>
+        <w:spacing w:before="60" w:after="80"/>
+        <w:ind w:firstLine="420"/>
+      </w:pPr>
+      <w:r>
+        <w:rPr>
+          <w:sz w:val="21"/>
+          <w:szCs w:val="21"/>
+          <w:rFonts w:ascii="宋体" w:hAnsi="宋体" w:eastAsia="宋体"/>
+        </w:rPr>
+        <w:t>步骤 7：继续查看工程状态清单，重点确认 best_fit_pmm.c、buddy_pmm.c、slub.c、slub_test.c 和相关头文件均已进入集成目录。这样可避免构建时漏编译模块。</w:t>
+      </w:r>
+    </w:p>
+    <w:p>
+      <w:pPr>
         <w:pStyle w:val="2"/>
         <w:keepNext w:val="0"/>
         <w:keepLines w:val="0"/>
@@ -3129,6 +3291,20 @@
     </w:p>
     <w:p>
       <w:pPr>
+        <w:spacing w:before="60" w:after="80"/>
+        <w:ind w:firstLine="420"/>
+      </w:pPr>
+      <w:r>
+        <w:rPr>
+          <w:sz w:val="21"/>
+          <w:szCs w:val="21"/>
+          <w:rFonts w:ascii="宋体" w:hAnsi="宋体" w:eastAsia="宋体"/>
+        </w:rPr>
+        <w:t>步骤 8：检查状态清单中的 report、tools 和测试日志项，确认本次实验没有误改评分脚本或教师提供的基础测试文件。</w:t>
+      </w:r>
+    </w:p>
+    <w:p>
+      <w:pPr>
         <w:pStyle w:val="2"/>
         <w:keepNext w:val="0"/>
         <w:keepLines w:val="0"/>
@@ -3195,6 +3371,20 @@
     </w:p>
     <w:p>
       <w:pPr>
+        <w:spacing w:before="60" w:after="80"/>
+        <w:ind w:firstLine="420"/>
+      </w:pPr>
+      <w:r>
+        <w:rPr>
+          <w:sz w:val="21"/>
+          <w:szCs w:val="21"/>
+          <w:rFonts w:ascii="宋体" w:hAnsi="宋体" w:eastAsia="宋体"/>
+        </w:rPr>
+        <w:t>步骤 9：完成文件核对后，记录当前工作区的版本控制状态。该记录用于在构建和调试结束后比对是否产生了非预期的源码改动。</w:t>
+      </w:r>
+    </w:p>
+    <w:p>
+      <w:pPr>
         <w:pStyle w:val="2"/>
         <w:keepNext w:val="0"/>
         <w:keepLines w:val="0"/>
@@ -3261,6 +3451,20 @@
     </w:p>
     <w:p>
       <w:pPr>
+        <w:spacing w:before="60" w:after="80"/>
+        <w:ind w:firstLine="420"/>
+      </w:pPr>
+      <w:r>
+        <w:rPr>
+          <w:sz w:val="21"/>
+          <w:szCs w:val="21"/>
+          <w:rFonts w:ascii="宋体" w:hAnsi="宋体" w:eastAsia="宋体"/>
+        </w:rPr>
+        <w:t>步骤 10：执行 make clean 清理旧目标文件，再执行 make 进行一次完整构建。完整构建同时覆盖 Page Init、Best-Fit、Buddy、SLUB 及其测试模块的编译与链接。</w:t>
+      </w:r>
+    </w:p>
+    <w:p>
+      <w:pPr>
         <w:pStyle w:val="2"/>
         <w:keepNext w:val="0"/>
         <w:keepLines w:val="0"/>
@@ -3327,6 +3531,20 @@
     </w:p>
     <w:p>
       <w:pPr>
+        <w:spacing w:before="60" w:after="80"/>
+        <w:ind w:firstLine="420"/>
+      </w:pPr>
+      <w:r>
+        <w:rPr>
+          <w:sz w:val="21"/>
+          <w:szCs w:val="21"/>
+          <w:rFonts w:ascii="宋体" w:hAnsi="宋体" w:eastAsia="宋体"/>
+        </w:rPr>
+        <w:t>步骤 11：执行 make qemu 启动内核，并观察串口输出中的 memory management、check_alloc_page() 和 slub_check() 标记。该步骤验证编译产物能够在 QEMU 中真正启动。</w:t>
+      </w:r>
+    </w:p>
+    <w:p>
+      <w:pPr>
         <w:pStyle w:val="2"/>
         <w:keepNext w:val="0"/>
         <w:keepLines w:val="0"/>
@@ -3393,6 +3611,20 @@
     </w:p>
     <w:p>
       <w:pPr>
+        <w:spacing w:before="60" w:after="80"/>
+        <w:ind w:firstLine="420"/>
+      </w:pPr>
+      <w:r>
+        <w:rPr>
+          <w:sz w:val="21"/>
+          <w:szCs w:val="21"/>
+          <w:rFonts w:ascii="宋体" w:hAnsi="宋体" w:eastAsia="宋体"/>
+        </w:rPr>
+        <w:t>步骤 12：执行 make grade 运行基础评分。评分输出用于确认 Page Init 与 Best-Fit 的教师测试均通过，并记录可复现的总分结果。</w:t>
+      </w:r>
+    </w:p>
+    <w:p>
+      <w:pPr>
         <w:pStyle w:val="2"/>
         <w:keepNext w:val="0"/>
         <w:keepLines w:val="0"/>
@@ -3490,6 +3722,36 @@
     </w:p>
     <w:p>
       <w:pPr>
+        <w:spacing w:before="140" w:after="100"/>
+        <w:keepNext/>
+      </w:pPr>
+      <w:r>
+        <w:rPr>
+          <w:b/>
+          <w:bCs/>
+          <w:sz w:val="28"/>
+          <w:szCs w:val="28"/>
+          <w:rFonts w:ascii="宋体" w:hAnsi="宋体" w:eastAsia="宋体"/>
+        </w:rPr>
+        <w:t>五、内核、Best-Fit 与 SLUB 的 GDB 调试</w:t>
+      </w:r>
+    </w:p>
+    <w:p>
+      <w:pPr>
+        <w:spacing w:before="60" w:after="80"/>
+        <w:ind w:firstLine="420"/>
+      </w:pPr>
+      <w:r>
+        <w:rPr>
+          <w:sz w:val="21"/>
+          <w:szCs w:val="21"/>
+          <w:rFonts w:ascii="宋体" w:hAnsi="宋体" w:eastAsia="宋体"/>
+        </w:rPr>
+        <w:t>步骤 13：为调试会话执行 make debug，重新生成带调试符号的内核镜像。GDB 后续显示的函数名、源文件和行号均以此镜像为依据。</w:t>
+      </w:r>
+    </w:p>
+    <w:p>
+      <w:pPr>
         <w:pStyle w:val="2"/>
         <w:keepNext w:val="0"/>
         <w:keepLines w:val="0"/>
@@ -3556,6 +3818,20 @@
     </w:p>
     <w:p>
       <w:pPr>
+        <w:spacing w:before="60" w:after="80"/>
+        <w:ind w:firstLine="420"/>
+      </w:pPr>
+      <w:r>
+        <w:rPr>
+          <w:sz w:val="21"/>
+          <w:szCs w:val="21"/>
+          <w:rFonts w:ascii="宋体" w:hAnsi="宋体" w:eastAsia="宋体"/>
+        </w:rPr>
+        <w:t>步骤 14：在 VS Code 的 Ports 面板确认 1234 已转发。该端口是 QEMU 暴露给 riscv64 GDB 的远程调试通道。</w:t>
+      </w:r>
+    </w:p>
+    <w:p>
+      <w:pPr>
         <w:pStyle w:val="2"/>
         <w:keepNext w:val="0"/>
         <w:keepLines w:val="0"/>
@@ -3622,6 +3898,20 @@
     </w:p>
     <w:p>
       <w:pPr>
+        <w:spacing w:before="60" w:after="80"/>
+        <w:ind w:firstLine="420"/>
+      </w:pPr>
+      <w:r>
+        <w:rPr>
+          <w:sz w:val="21"/>
+          <w:szCs w:val="21"/>
+          <w:rFonts w:ascii="宋体" w:hAnsi="宋体" w:eastAsia="宋体"/>
+        </w:rPr>
+        <w:t>步骤 15：执行 make gdb，使 RISC-V GDB 连接 localhost:1234。连接成功后才能在来宾内核中设置断点并读取寄存器。</w:t>
+      </w:r>
+    </w:p>
+    <w:p>
+      <w:pPr>
         <w:pStyle w:val="2"/>
         <w:keepNext w:val="0"/>
         <w:keepLines w:val="0"/>
@@ -3688,6 +3978,20 @@
     </w:p>
     <w:p>
       <w:pPr>
+        <w:spacing w:before="60" w:after="80"/>
+        <w:ind w:firstLine="420"/>
+      </w:pPr>
+      <w:r>
+        <w:rPr>
+          <w:sz w:val="21"/>
+          <w:szCs w:val="21"/>
+          <w:rFonts w:ascii="宋体" w:hAnsi="宋体" w:eastAsia="宋体"/>
+        </w:rPr>
+        <w:t>步骤 16：在 kern_init() 设置断点并继续运行。首先命中内核入口可证明调试符号和 QEMU 调试端口均与当前镜像对应。</w:t>
+      </w:r>
+    </w:p>
+    <w:p>
+      <w:pPr>
         <w:pStyle w:val="2"/>
         <w:keepNext w:val="0"/>
         <w:keepLines w:val="0"/>
@@ -3754,6 +4058,20 @@
     </w:p>
     <w:p>
       <w:pPr>
+        <w:spacing w:before="60" w:after="80"/>
+        <w:ind w:firstLine="420"/>
+      </w:pPr>
+      <w:r>
+        <w:rPr>
+          <w:sz w:val="21"/>
+          <w:szCs w:val="21"/>
+          <w:rFonts w:ascii="宋体" w:hAnsi="宋体" w:eastAsia="宋体"/>
+        </w:rPr>
+        <w:t>步骤 17：重新展示调试构建和 QEMU 启动过程，确认调试会话运行的镜像确实包含本次合入的 Best-Fit、Buddy 和 SLUB 模块。</w:t>
+      </w:r>
+    </w:p>
+    <w:p>
+      <w:pPr>
         <w:pStyle w:val="2"/>
         <w:keepNext w:val="0"/>
         <w:keepLines w:val="0"/>
@@ -3820,6 +4138,20 @@
     </w:p>
     <w:p>
       <w:pPr>
+        <w:spacing w:before="60" w:after="80"/>
+        <w:ind w:firstLine="420"/>
+      </w:pPr>
+      <w:r>
+        <w:rPr>
+          <w:sz w:val="21"/>
+          <w:szCs w:val="21"/>
+          <w:rFonts w:ascii="宋体" w:hAnsi="宋体" w:eastAsia="宋体"/>
+        </w:rPr>
+        <w:t>步骤 18：在 kern_init() 停止后读取 $pc、satp、反汇编和调用栈。通过 PC 与 satp 可以同时确认内核入口地址和 Sv39 页表根寄存器状态。</w:t>
+      </w:r>
+    </w:p>
+    <w:p>
+      <w:pPr>
         <w:pStyle w:val="2"/>
         <w:keepNext w:val="0"/>
         <w:keepLines w:val="0"/>
@@ -3886,6 +4218,20 @@
     </w:p>
     <w:p>
       <w:pPr>
+        <w:spacing w:before="60" w:after="80"/>
+        <w:ind w:firstLine="420"/>
+      </w:pPr>
+      <w:r>
+        <w:rPr>
+          <w:sz w:val="21"/>
+          <w:szCs w:val="21"/>
+          <w:rFonts w:ascii="宋体" w:hAnsi="宋体" w:eastAsia="宋体"/>
+        </w:rPr>
+        <w:t>步骤 19：为 pmm_init() 设置断点并继续执行。命中该函数说明内核启动流程已经进入物理内存管理初始化阶段。</w:t>
+      </w:r>
+    </w:p>
+    <w:p>
+      <w:pPr>
         <w:pStyle w:val="2"/>
         <w:keepNext w:val="0"/>
         <w:keepLines w:val="0"/>
@@ -3952,6 +4298,20 @@
     </w:p>
     <w:p>
       <w:pPr>
+        <w:spacing w:before="60" w:after="80"/>
+        <w:ind w:firstLine="420"/>
+      </w:pPr>
+      <w:r>
+        <w:rPr>
+          <w:sz w:val="21"/>
+          <w:szCs w:val="21"/>
+          <w:rFonts w:ascii="宋体" w:hAnsi="宋体" w:eastAsia="宋体"/>
+        </w:rPr>
+        <w:t>步骤 20：在 QEMU 串口日志中记录设备树给出的物理内存范围、内核符号边界和内核占用空间。这些数据是 page_init 计算受管页范围的输入。</w:t>
+      </w:r>
+    </w:p>
+    <w:p>
+      <w:pPr>
         <w:pStyle w:val="2"/>
         <w:keepNext w:val="0"/>
         <w:keepLines w:val="0"/>
@@ -4022,6 +4382,20 @@
     </w:p>
     <w:p>
       <w:pPr>
+        <w:spacing w:before="60" w:after="80"/>
+        <w:ind w:firstLine="420"/>
+      </w:pPr>
+      <w:r>
+        <w:rPr>
+          <w:sz w:val="21"/>
+          <w:szCs w:val="21"/>
+          <w:rFonts w:ascii="宋体" w:hAnsi="宋体" w:eastAsia="宋体"/>
+        </w:rPr>
+        <w:t>步骤 21：在 pmm_init() 内查看寄存器、调用栈和源码行，核对 init_pmm_manager() 之后调用 page_init() 的顺序。该检查说明页面描述符初始化与后续自检的先后关系。</w:t>
+      </w:r>
+    </w:p>
+    <w:p>
+      <w:pPr>
         <w:pStyle w:val="2"/>
         <w:keepNext w:val="0"/>
         <w:keepLines w:val="0"/>
@@ -4088,6 +4462,20 @@
     </w:p>
     <w:p>
       <w:pPr>
+        <w:spacing w:before="60" w:after="80"/>
+        <w:ind w:firstLine="420"/>
+      </w:pPr>
+      <w:r>
+        <w:rPr>
+          <w:sz w:val="21"/>
+          <w:szCs w:val="21"/>
+          <w:rFonts w:ascii="宋体" w:hAnsi="宋体" w:eastAsia="宋体"/>
+        </w:rPr>
+        <w:t>步骤 22：暂时在 best_fit_alloc_pages() 设置断点并继续运行。请求 n=1 的断点命中证明基础自检已经调用到 Best-Fit 管理器。</w:t>
+      </w:r>
+    </w:p>
+    <w:p>
+      <w:pPr>
         <w:pStyle w:val="2"/>
         <w:keepNext w:val="0"/>
         <w:keepLines w:val="0"/>
@@ -4154,6 +4542,20 @@
     </w:p>
     <w:p>
       <w:pPr>
+        <w:spacing w:before="60" w:after="80"/>
+        <w:ind w:firstLine="420"/>
+      </w:pPr>
+      <w:r>
+        <w:rPr>
+          <w:sz w:val="21"/>
+          <w:szCs w:val="21"/>
+          <w:rFonts w:ascii="宋体" w:hAnsi="宋体" w:eastAsia="宋体"/>
+        </w:rPr>
+        <w:t>步骤 23：结合 QEMU 串口中的 memory management: best_fit_pmm_manager 输出，确认普通实验配置实际注册并启用了 Best-Fit，而不是默认 First-Fit 或 Buddy。</w:t>
+      </w:r>
+    </w:p>
+    <w:p>
+      <w:pPr>
         <w:pStyle w:val="2"/>
         <w:keepNext w:val="0"/>
         <w:keepLines w:val="0"/>
@@ -4220,6 +4622,20 @@
     </w:p>
     <w:p>
       <w:pPr>
+        <w:spacing w:before="60" w:after="80"/>
+        <w:ind w:firstLine="420"/>
+      </w:pPr>
+      <w:r>
+        <w:rPr>
+          <w:sz w:val="21"/>
+          <w:szCs w:val="21"/>
+          <w:rFonts w:ascii="宋体" w:hAnsi="宋体" w:eastAsia="宋体"/>
+        </w:rPr>
+        <w:t>步骤 24：在 Best-Fit 分配函数处执行 bt 查看调用栈。调用链应包含 basic_check()、best_fit_check()、check_alloc_page()、pmm_init() 和 kern_init()，用于验证测试入口。</w:t>
+      </w:r>
+    </w:p>
+    <w:p>
+      <w:pPr>
         <w:pStyle w:val="2"/>
         <w:keepNext w:val="0"/>
         <w:keepLines w:val="0"/>
@@ -4286,6 +4702,20 @@
     </w:p>
     <w:p>
       <w:pPr>
+        <w:spacing w:before="60" w:after="80"/>
+        <w:ind w:firstLine="420"/>
+      </w:pPr>
+      <w:r>
+        <w:rPr>
+          <w:sz w:val="21"/>
+          <w:szCs w:val="21"/>
+          <w:rFonts w:ascii="宋体" w:hAnsi="宋体" w:eastAsia="宋体"/>
+        </w:rPr>
+        <w:t>步骤 25：查看 best_fit_alloc_pages() 和 best_fit_free_pages() 的关键源码。依次检查最小满足块选择、剩余块拆分、nr_free 更新以及释放时的相邻块合并。</w:t>
+      </w:r>
+    </w:p>
+    <w:p>
+      <w:pPr>
         <w:pStyle w:val="2"/>
         <w:keepNext w:val="0"/>
         <w:keepLines w:val="0"/>
@@ -4352,6 +4782,20 @@
     </w:p>
     <w:p>
       <w:pPr>
+        <w:spacing w:before="60" w:after="80"/>
+        <w:ind w:firstLine="420"/>
+      </w:pPr>
+      <w:r>
+        <w:rPr>
+          <w:sz w:val="21"/>
+          <w:szCs w:val="21"/>
+          <w:rFonts w:ascii="宋体" w:hAnsi="宋体" w:eastAsia="宋体"/>
+        </w:rPr>
+        <w:t>步骤 26：将断点切换到 slub_alloc()，先让 slub_test() 发出 size=0 的请求。分配器应立即返回 NULL，这一分支验证零大小对象不会占用 SLUB 页面。</w:t>
+      </w:r>
+    </w:p>
+    <w:p>
+      <w:pPr>
         <w:pStyle w:val="2"/>
         <w:keepNext w:val="0"/>
         <w:keepLines w:val="0"/>
@@ -4418,6 +4862,20 @@
     </w:p>
     <w:p>
       <w:pPr>
+        <w:spacing w:before="60" w:after="80"/>
+        <w:ind w:firstLine="420"/>
+      </w:pPr>
+      <w:r>
+        <w:rPr>
+          <w:sz w:val="21"/>
+          <w:szCs w:val="21"/>
+          <w:rFonts w:ascii="宋体" w:hAnsi="宋体" w:eastAsia="宋体"/>
+        </w:rPr>
+        <w:t>步骤 27：继续运行并观察 QEMU 端的启动和 SLUB 调用日志。该步骤确认 SLUB 自检确实在 pmm_init() 完成后被调用。</w:t>
+      </w:r>
+    </w:p>
+    <w:p>
+      <w:pPr>
         <w:pStyle w:val="2"/>
         <w:keepNext w:val="0"/>
         <w:keepLines w:val="0"/>
@@ -4484,6 +4942,20 @@
     </w:p>
     <w:p>
       <w:pPr>
+        <w:spacing w:before="60" w:after="80"/>
+        <w:ind w:firstLine="420"/>
+      </w:pPr>
+      <w:r>
+        <w:rPr>
+          <w:sz w:val="21"/>
+          <w:szCs w:val="21"/>
+          <w:rFonts w:ascii="宋体" w:hAnsi="宋体" w:eastAsia="宋体"/>
+        </w:rPr>
+        <w:t>步骤 28：结束零大小调用后，继续执行超过支持上限的对象申请。该检查验证分配器能拒绝无匹配缓存的异常大小请求。</w:t>
+      </w:r>
+    </w:p>
+    <w:p>
+      <w:pPr>
         <w:pStyle w:val="2"/>
         <w:keepNext w:val="0"/>
         <w:keepLines w:val="0"/>
@@ -4550,6 +5022,20 @@
     </w:p>
     <w:p>
       <w:pPr>
+        <w:spacing w:before="60" w:after="80"/>
+        <w:ind w:firstLine="420"/>
+      </w:pPr>
+      <w:r>
+        <w:rPr>
+          <w:sz w:val="21"/>
+          <w:szCs w:val="21"/>
+          <w:rFonts w:ascii="宋体" w:hAnsi="宋体" w:eastAsia="宋体"/>
+        </w:rPr>
+        <w:t>步骤 29：在 size=1025 的 slub_alloc() 调用处停下，查看请求值以及调用来源。该对象大小超出 1024 字节上限，应由 slub_test() 的边界断言验证为 NULL。</w:t>
+      </w:r>
+    </w:p>
+    <w:p>
+      <w:pPr>
         <w:pStyle w:val="2"/>
         <w:keepNext w:val="0"/>
         <w:keepLines w:val="0"/>
@@ -4616,6 +5102,20 @@
     </w:p>
     <w:p>
       <w:pPr>
+        <w:spacing w:before="60" w:after="80"/>
+        <w:ind w:firstLine="420"/>
+      </w:pPr>
+      <w:r>
+        <w:rPr>
+          <w:sz w:val="21"/>
+          <w:szCs w:val="21"/>
+          <w:rFonts w:ascii="宋体" w:hAnsi="宋体" w:eastAsia="宋体"/>
+        </w:rPr>
+        <w:t>步骤 30：查看 size=1025 时 slub_alloc() 的实现路径。slub_find_cache(size) 未找到缓存时直接返回 NULL，避免继续分配页面造成错误。</w:t>
+      </w:r>
+    </w:p>
+    <w:p>
+      <w:pPr>
         <w:pStyle w:val="2"/>
         <w:keepNext w:val="0"/>
         <w:keepLines w:val="0"/>
@@ -4682,6 +5182,20 @@
     </w:p>
     <w:p>
       <w:pPr>
+        <w:spacing w:before="60" w:after="80"/>
+        <w:ind w:firstLine="420"/>
+      </w:pPr>
+      <w:r>
+        <w:rPr>
+          <w:sz w:val="21"/>
+          <w:szCs w:val="21"/>
+          <w:rFonts w:ascii="宋体" w:hAnsi="宋体" w:eastAsia="宋体"/>
+        </w:rPr>
+        <w:t>步骤 31：使用 finish 回到 slub_test() 并读取返回值。返回 0x0 与 assert(slub_alloc(1025) == NULL) 一致，完成超范围条件的验证。</w:t>
+      </w:r>
+    </w:p>
+    <w:p>
+      <w:pPr>
         <w:pStyle w:val="2"/>
         <w:keepNext w:val="0"/>
         <w:keepLines w:val="0"/>
@@ -4748,6 +5262,20 @@
     </w:p>
     <w:p>
       <w:pPr>
+        <w:spacing w:before="60" w:after="80"/>
+        <w:ind w:firstLine="420"/>
+      </w:pPr>
+      <w:r>
+        <w:rPr>
+          <w:sz w:val="21"/>
+          <w:szCs w:val="21"/>
+          <w:rFonts w:ascii="宋体" w:hAnsi="宋体" w:eastAsia="宋体"/>
+        </w:rPr>
+        <w:t>步骤 32：设置条件断点只观察 0&lt;size&lt;=1024 的正常申请，再让 size=8 请求进入 slub_alloc()。该步骤将正常路径与前面的失败分支分开验证。</w:t>
+      </w:r>
+    </w:p>
+    <w:p>
+      <w:pPr>
         <w:pStyle w:val="2"/>
         <w:keepNext w:val="0"/>
         <w:keepLines w:val="0"/>
@@ -4814,6 +5342,20 @@
     </w:p>
     <w:p>
       <w:pPr>
+        <w:spacing w:before="60" w:after="80"/>
+        <w:ind w:firstLine="420"/>
+      </w:pPr>
+      <w:r>
+        <w:rPr>
+          <w:sz w:val="21"/>
+          <w:szCs w:val="21"/>
+          <w:rFonts w:ascii="宋体" w:hAnsi="宋体" w:eastAsia="宋体"/>
+        </w:rPr>
+        <w:t>步骤 33：在 size=8 的调用处检查 slub_find_cache()、slub_new_slab() 和空闲链表取对象的代码路径。目标是确认有效对象能对齐分配并复用空闲槽。</w:t>
+      </w:r>
+    </w:p>
+    <w:p>
+      <w:pPr>
         <w:pStyle w:val="2"/>
         <w:keepNext w:val="0"/>
         <w:keepLines w:val="0"/>
@@ -4880,6 +5422,20 @@
     </w:p>
     <w:p>
       <w:pPr>
+        <w:spacing w:before="60" w:after="80"/>
+        <w:ind w:firstLine="420"/>
+      </w:pPr>
+      <w:r>
+        <w:rPr>
+          <w:sz w:val="21"/>
+          <w:szCs w:val="21"/>
+          <w:rFonts w:ascii="宋体" w:hAnsi="宋体" w:eastAsia="宋体"/>
+        </w:rPr>
+        <w:t>步骤 34：在边界和正常对象路径均观察完成后禁用临时断点并继续运行。这样可以让完整 slub_test() 执行到资源回收和最终断言。</w:t>
+      </w:r>
+    </w:p>
+    <w:p>
+      <w:pPr>
         <w:pStyle w:val="2"/>
         <w:keepNext w:val="0"/>
         <w:keepLines w:val="0"/>
@@ -4946,6 +5502,20 @@
     </w:p>
     <w:p>
       <w:pPr>
+        <w:spacing w:before="60" w:after="80"/>
+        <w:ind w:firstLine="420"/>
+      </w:pPr>
+      <w:r>
+        <w:rPr>
+          <w:sz w:val="21"/>
+          <w:szCs w:val="21"/>
+          <w:rFonts w:ascii="宋体" w:hAnsi="宋体" w:eastAsia="宋体"/>
+        </w:rPr>
+        <w:t>步骤 35：观察 QEMU 输出的 slub_check() succeeded!。该成功标记综合说明对象申请、交替释放、槽位复用、页回收和空闲页计数恢复检查均通过。</w:t>
+      </w:r>
+    </w:p>
+    <w:p>
+      <w:pPr>
         <w:pStyle w:val="2"/>
         <w:keepNext w:val="0"/>
         <w:keepLines w:val="0"/>
@@ -5042,6 +5612,36 @@
     </w:p>
     <w:p>
       <w:pPr>
+        <w:spacing w:before="140" w:after="100"/>
+        <w:keepNext/>
+      </w:pPr>
+      <w:r>
+        <w:rPr>
+          <w:b/>
+          <w:bCs/>
+          <w:sz w:val="28"/>
+          <w:szCs w:val="28"/>
+          <w:rFonts w:ascii="宋体" w:hAnsi="宋体" w:eastAsia="宋体"/>
+        </w:rPr>
+        <w:t>六、QEMU TLB 地址转换跟踪</w:t>
+      </w:r>
+    </w:p>
+    <w:p>
+      <w:pPr>
+        <w:spacing w:before="60" w:after="80"/>
+        <w:ind w:firstLine="420"/>
+      </w:pPr>
+      <w:r>
+        <w:rPr>
+          <w:sz w:val="21"/>
+          <w:szCs w:val="21"/>
+          <w:rFonts w:ascii="宋体" w:hAnsi="宋体" w:eastAsia="宋体"/>
+        </w:rPr>
+        <w:t>步骤 36：切换到宿主机 QEMU 调试，启动宿主机 GDB 并对 riscv_cpu_tlb_fill() 与 get_physical_address() 设置断点。此处开始跟踪 QEMU 如何处理来宾的地址翻译。</w:t>
+      </w:r>
+    </w:p>
+    <w:p>
+      <w:pPr>
         <w:pStyle w:val="2"/>
         <w:keepNext w:val="0"/>
         <w:keepLines w:val="0"/>
@@ -5108,6 +5708,20 @@
     </w:p>
     <w:p>
       <w:pPr>
+        <w:spacing w:before="60" w:after="80"/>
+        <w:ind w:firstLine="420"/>
+      </w:pPr>
+      <w:r>
+        <w:rPr>
+          <w:sz w:val="21"/>
+          <w:szCs w:val="21"/>
+          <w:rFonts w:ascii="宋体" w:hAnsi="宋体" w:eastAsia="宋体"/>
+        </w:rPr>
+        <w:t>步骤 37：尝试通过来宾 RISC-V GDB 继续调试时出现远程包错误。该现象被如实记录，随后改由宿主机 GDB 附加 QEMU 进程完成 TLB 路径观察。</w:t>
+      </w:r>
+    </w:p>
+    <w:p>
+      <w:pPr>
         <w:pStyle w:val="2"/>
         <w:keepNext w:val="0"/>
         <w:keepLines w:val="0"/>
@@ -5174,6 +5788,20 @@
     </w:p>
     <w:p>
       <w:pPr>
+        <w:spacing w:before="60" w:after="80"/>
+        <w:ind w:firstLine="420"/>
+      </w:pPr>
+      <w:r>
+        <w:rPr>
+          <w:sz w:val="21"/>
+          <w:szCs w:val="21"/>
+          <w:rFonts w:ascii="宋体" w:hAnsi="宋体" w:eastAsia="宋体"/>
+        </w:rPr>
+        <w:t>步骤 38：在 GDB 中尝试使用 set args 配置 QEMU 启动参数，命令返回参数格式错误。这一步说明 QEMU 需从宿主机命令行以 -s -S 启动，而不能把整条启动命令直接作为当前 GDB 的 run 参数。</w:t>
+      </w:r>
+    </w:p>
+    <w:p>
+      <w:pPr>
         <w:pStyle w:val="2"/>
         <w:keepNext w:val="0"/>
         <w:keepLines w:val="0"/>
@@ -5240,6 +5868,20 @@
     </w:p>
     <w:p>
       <w:pPr>
+        <w:spacing w:before="60" w:after="80"/>
+        <w:ind w:firstLine="420"/>
+      </w:pPr>
+      <w:r>
+        <w:rPr>
+          <w:sz w:val="21"/>
+          <w:szCs w:val="21"/>
+          <w:rFonts w:ascii="宋体" w:hAnsi="宋体" w:eastAsia="宋体"/>
+        </w:rPr>
+        <w:t>步骤 39：将错误配置与正确启动方式对照：先记录错误输出，再在下一步改用宿主机 qemu-system-riscv64 命令。该排查过程说明调试通道配置已被验证。</w:t>
+      </w:r>
+    </w:p>
+    <w:p>
+      <w:pPr>
         <w:pStyle w:val="2"/>
         <w:keepNext w:val="0"/>
         <w:keepLines w:val="0"/>
@@ -5306,6 +5948,20 @@
     </w:p>
     <w:p>
       <w:pPr>
+        <w:spacing w:before="60" w:after="80"/>
+        <w:ind w:firstLine="420"/>
+      </w:pPr>
+      <w:r>
+        <w:rPr>
+          <w:sz w:val="21"/>
+          <w:szCs w:val="21"/>
+          <w:rFonts w:ascii="宋体" w:hAnsi="宋体" w:eastAsia="宋体"/>
+        </w:rPr>
+        <w:t>步骤 40：在宿主机命令行以 -s -S 启动 qemu-system-riscv64。-S 让模拟器暂停，-s 打开 TCP 1234，便于在内核执行前连接调试器。</w:t>
+      </w:r>
+    </w:p>
+    <w:p>
+      <w:pPr>
         <w:pStyle w:val="2"/>
         <w:keepNext w:val="0"/>
         <w:keepLines w:val="0"/>
@@ -5376,6 +6032,20 @@
     </w:p>
     <w:p>
       <w:pPr>
+        <w:spacing w:before="60" w:after="80"/>
+        <w:ind w:firstLine="420"/>
+      </w:pPr>
+      <w:r>
+        <w:rPr>
+          <w:sz w:val="21"/>
+          <w:szCs w:val="21"/>
+          <w:rFonts w:ascii="宋体" w:hAnsi="宋体" w:eastAsia="宋体"/>
+        </w:rPr>
+        <w:t>步骤 41：通过 pgrep 和 ss 检查 QEMU 进程及 1234 监听端口。只有进程存在且端口处于 LISTEN 状态，GDB 才能可靠附加。</w:t>
+      </w:r>
+    </w:p>
+    <w:p>
+      <w:pPr>
         <w:pStyle w:val="2"/>
         <w:keepNext w:val="0"/>
         <w:keepLines w:val="0"/>
@@ -5442,6 +6112,20 @@
     </w:p>
     <w:p>
       <w:pPr>
+        <w:spacing w:before="60" w:after="80"/>
+        <w:ind w:firstLine="420"/>
+      </w:pPr>
+      <w:r>
+        <w:rPr>
+          <w:sz w:val="21"/>
+          <w:szCs w:val="21"/>
+          <w:rFonts w:ascii="宋体" w:hAnsi="宋体" w:eastAsia="宋体"/>
+        </w:rPr>
+        <w:t>步骤 42：在 VS Code Ports 面板确认 localhost:1234 的转发记录。该步骤补充验证编辑器环境中的端口通路可用。</w:t>
+      </w:r>
+    </w:p>
+    <w:p>
+      <w:pPr>
         <w:pStyle w:val="2"/>
         <w:keepNext w:val="0"/>
         <w:keepLines w:val="0"/>
@@ -5508,6 +6192,20 @@
     </w:p>
     <w:p>
       <w:pPr>
+        <w:spacing w:before="60" w:after="80"/>
+        <w:ind w:firstLine="420"/>
+      </w:pPr>
+      <w:r>
+        <w:rPr>
+          <w:sz w:val="21"/>
+          <w:szCs w:val="21"/>
+          <w:rFonts w:ascii="宋体" w:hAnsi="宋体" w:eastAsia="宋体"/>
+        </w:rPr>
+        <w:t>步骤 43：使用宿主机 GDB 附加运行中的 qemu-system-riscv64 进程，并观察主线程和 RISC-V CPU 线程。附加后可在 QEMU 源码层面设置 TLB 断点。</w:t>
+      </w:r>
+    </w:p>
+    <w:p>
+      <w:pPr>
         <w:pStyle w:val="2"/>
         <w:keepNext w:val="0"/>
         <w:keepLines w:val="0"/>
@@ -5574,6 +6272,20 @@
     </w:p>
     <w:p>
       <w:pPr>
+        <w:spacing w:before="60" w:after="80"/>
+        <w:ind w:firstLine="420"/>
+      </w:pPr>
+      <w:r>
+        <w:rPr>
+          <w:sz w:val="21"/>
+          <w:szCs w:val="21"/>
+          <w:rFonts w:ascii="宋体" w:hAnsi="宋体" w:eastAsia="宋体"/>
+        </w:rPr>
+        <w:t>步骤 44：同时保持来宾 RISC-V GDB 会话，在 kern_init() 处断下。宿主机调试 QEMU、来宾调试内核两条视角由此对应。</w:t>
+      </w:r>
+    </w:p>
+    <w:p>
+      <w:pPr>
         <w:pStyle w:val="2"/>
         <w:keepNext w:val="0"/>
         <w:keepLines w:val="0"/>
@@ -5640,6 +6352,20 @@
     </w:p>
     <w:p>
       <w:pPr>
+        <w:spacing w:before="60" w:after="80"/>
+        <w:ind w:firstLine="420"/>
+      </w:pPr>
+      <w:r>
+        <w:rPr>
+          <w:sz w:val="21"/>
+          <w:szCs w:val="21"/>
+          <w:rFonts w:ascii="宋体" w:hAnsi="宋体" w:eastAsia="宋体"/>
+        </w:rPr>
+        <w:t>步骤 45：在来宾 kern_init() 读取 PC 和 satp。satp 的 PPN 字段提供根页表物理基址，后续会在 QEMU 的 get_physical_address() 中使用。</w:t>
+      </w:r>
+    </w:p>
+    <w:p>
+      <w:pPr>
         <w:pStyle w:val="2"/>
         <w:keepNext w:val="0"/>
         <w:keepLines w:val="0"/>
@@ -5706,6 +6432,20 @@
     </w:p>
     <w:p>
       <w:pPr>
+        <w:spacing w:before="60" w:after="80"/>
+        <w:ind w:firstLine="420"/>
+      </w:pPr>
+      <w:r>
+        <w:rPr>
+          <w:sz w:val="21"/>
+          <w:szCs w:val="21"/>
+          <w:rFonts w:ascii="宋体" w:hAnsi="宋体" w:eastAsia="宋体"/>
+        </w:rPr>
+        <w:t>步骤 46：恢复 QEMU 后观察其启动串口输出。固件、设备树与内核信息用于确认来宾已从暂停点继续进入正常执行。</w:t>
+      </w:r>
+    </w:p>
+    <w:p>
+      <w:pPr>
         <w:pStyle w:val="2"/>
         <w:keepNext w:val="0"/>
         <w:keepLines w:val="0"/>
@@ -5772,6 +6512,20 @@
     </w:p>
     <w:p>
       <w:pPr>
+        <w:spacing w:before="60" w:after="80"/>
+        <w:ind w:firstLine="420"/>
+      </w:pPr>
+      <w:r>
+        <w:rPr>
+          <w:sz w:val="21"/>
+          <w:szCs w:val="21"/>
+          <w:rFonts w:ascii="宋体" w:hAnsi="宋体" w:eastAsia="宋体"/>
+        </w:rPr>
+        <w:t>步骤 47：在宿主机 GDB 中继续 QEMU，必要时用 SIGINT 停下并设置 riscv_cpu_tlb_fill()、get_physical_address() 断点。两个断点分别观察 TLB 填充入口和页表翻译函数。</w:t>
+      </w:r>
+    </w:p>
+    <w:p>
+      <w:pPr>
         <w:pStyle w:val="2"/>
         <w:keepNext w:val="0"/>
         <w:keepLines w:val="0"/>
@@ -5838,6 +6592,20 @@
     </w:p>
     <w:p>
       <w:pPr>
+        <w:spacing w:before="60" w:after="80"/>
+        <w:ind w:firstLine="420"/>
+      </w:pPr>
+      <w:r>
+        <w:rPr>
+          <w:sz w:val="21"/>
+          <w:szCs w:val="21"/>
+          <w:rFonts w:ascii="宋体" w:hAnsi="宋体" w:eastAsia="宋体"/>
+        </w:rPr>
+        <w:t>步骤 48：在来宾侧继续执行，触发一次实际内存访问。该访问会使宿主机 QEMU 的 TLB 处理函数获得命中机会。</w:t>
+      </w:r>
+    </w:p>
+    <w:p>
+      <w:pPr>
         <w:pStyle w:val="2"/>
         <w:keepNext w:val="0"/>
         <w:keepLines w:val="0"/>
@@ -5904,6 +6672,20 @@
     </w:p>
     <w:p>
       <w:pPr>
+        <w:spacing w:before="60" w:after="80"/>
+        <w:ind w:firstLine="420"/>
+      </w:pPr>
+      <w:r>
+        <w:rPr>
+          <w:sz w:val="21"/>
+          <w:szCs w:val="21"/>
+          <w:rFonts w:ascii="宋体" w:hAnsi="宋体" w:eastAsia="宋体"/>
+        </w:rPr>
+        <w:t>步骤 49：来宾执行被中断后停在 kern_init()。该可控停止点证明来宾 GDB 会话仍可用于协调宿主机侧的 QEMU 调试。</w:t>
+      </w:r>
+    </w:p>
+    <w:p>
+      <w:pPr>
         <w:pStyle w:val="2"/>
         <w:keepNext w:val="0"/>
         <w:keepLines w:val="0"/>
@@ -5970,6 +6752,20 @@
     </w:p>
     <w:p>
       <w:pPr>
+        <w:spacing w:before="60" w:after="80"/>
+        <w:ind w:firstLine="420"/>
+      </w:pPr>
+      <w:r>
+        <w:rPr>
+          <w:sz w:val="21"/>
+          <w:szCs w:val="21"/>
+          <w:rFonts w:ascii="宋体" w:hAnsi="宋体" w:eastAsia="宋体"/>
+        </w:rPr>
+        <w:t>步骤 50：宿主机 GDB 命中 get_physical_address()。这说明来宾一次内存访问已经进入 QEMU 的物理地址翻译函数。</w:t>
+      </w:r>
+    </w:p>
+    <w:p>
+      <w:pPr>
         <w:pStyle w:val="2"/>
         <w:keepNext w:val="0"/>
         <w:keepLines w:val="0"/>
@@ -6036,6 +6832,20 @@
     </w:p>
     <w:p>
       <w:pPr>
+        <w:spacing w:before="60" w:after="80"/>
+        <w:ind w:firstLine="420"/>
+      </w:pPr>
+      <w:r>
+        <w:rPr>
+          <w:sz w:val="21"/>
+          <w:szCs w:val="21"/>
+          <w:rFonts w:ascii="宋体" w:hAnsi="宋体" w:eastAsia="宋体"/>
+        </w:rPr>
+        <w:t>步骤 51：在 get_physical_address() 中查看参数和调用栈，记录 env、地址、访问类型、大小以及调用者 riscv_cpu_tlb_fill()。这些变量构成页表遍历的输入。</w:t>
+      </w:r>
+    </w:p>
+    <w:p>
+      <w:pPr>
         <w:pStyle w:val="2"/>
         <w:keepNext w:val="0"/>
         <w:keepLines w:val="0"/>
@@ -6102,6 +6912,20 @@
     </w:p>
     <w:p>
       <w:pPr>
+        <w:spacing w:before="60" w:after="80"/>
+        <w:ind w:firstLine="420"/>
+      </w:pPr>
+      <w:r>
+        <w:rPr>
+          <w:sz w:val="21"/>
+          <w:szCs w:val="21"/>
+          <w:rFonts w:ascii="宋体" w:hAnsi="宋体" w:eastAsia="宋体"/>
+        </w:rPr>
+        <w:t>步骤 52：查看 get_physical_address() 的源码开头，确认当前 MMU 模式、satp PPN、页表层级 levels 和每级索引位数 ptidxbits 的计算方式。</w:t>
+      </w:r>
+    </w:p>
+    <w:p>
+      <w:pPr>
         <w:pStyle w:val="2"/>
         <w:keepNext w:val="0"/>
         <w:keepLines w:val="0"/>
@@ -6168,6 +6992,20 @@
     </w:p>
     <w:p>
       <w:pPr>
+        <w:spacing w:before="60" w:after="80"/>
+        <w:ind w:firstLine="420"/>
+      </w:pPr>
+      <w:r>
+        <w:rPr>
+          <w:sz w:val="21"/>
+          <w:szCs w:val="21"/>
+          <w:rFonts w:ascii="宋体" w:hAnsi="宋体" w:eastAsia="宋体"/>
+        </w:rPr>
+        <w:t>步骤 53：根据 env-&gt;satp 计算根页表 base，并再次列出断点后继续运行。这样可把寄存器值、页表基址和实际断点位置对应起来。</w:t>
+      </w:r>
+    </w:p>
+    <w:p>
+      <w:pPr>
         <w:pStyle w:val="2"/>
         <w:keepNext w:val="0"/>
         <w:keepLines w:val="0"/>
@@ -6234,6 +7072,20 @@
     </w:p>
     <w:p>
       <w:pPr>
+        <w:spacing w:before="60" w:after="80"/>
+        <w:ind w:firstLine="420"/>
+      </w:pPr>
+      <w:r>
+        <w:rPr>
+          <w:sz w:val="21"/>
+          <w:szCs w:val="21"/>
+          <w:rFonts w:ascii="宋体" w:hAnsi="宋体" w:eastAsia="宋体"/>
+        </w:rPr>
+        <w:t>步骤 54：riscv_cpu_tlb_fill() 命中时，记录 vaddr、访问类型和地址翻译调用路径。该入口负责把一次 TLB 未命中交给 get_physical_address()。</w:t>
+      </w:r>
+    </w:p>
+    <w:p>
+      <w:pPr>
         <w:pStyle w:val="2"/>
         <w:keepNext w:val="0"/>
         <w:keepLines w:val="0"/>
@@ -6300,6 +7152,20 @@
     </w:p>
     <w:p>
       <w:pPr>
+        <w:spacing w:before="60" w:after="80"/>
+        <w:ind w:firstLine="420"/>
+      </w:pPr>
+      <w:r>
+        <w:rPr>
+          <w:sz w:val="21"/>
+          <w:szCs w:val="21"/>
+          <w:rFonts w:ascii="宋体" w:hAnsi="宋体" w:eastAsia="宋体"/>
+        </w:rPr>
+        <w:t>步骤 55：进入 get_physical_address() 后查看 args 和 backtrace。重点核对虚拟地址、访问大小、访问权限上下文及物理地址输出参数。</w:t>
+      </w:r>
+    </w:p>
+    <w:p>
+      <w:pPr>
         <w:pStyle w:val="2"/>
         <w:keepNext w:val="0"/>
         <w:keepLines w:val="0"/>
@@ -6366,6 +7232,20 @@
     </w:p>
     <w:p>
       <w:pPr>
+        <w:spacing w:before="60" w:after="80"/>
+        <w:ind w:firstLine="420"/>
+      </w:pPr>
+      <w:r>
+        <w:rPr>
+          <w:sz w:val="21"/>
+          <w:szCs w:val="21"/>
+          <w:rFonts w:ascii="宋体" w:hAnsi="宋体" w:eastAsia="宋体"/>
+        </w:rPr>
+        <w:t>步骤 56：查看 riscv_cpu_tlb_fill() 调用 get_physical_address() 后的源码分支。翻译成功时该函数会整理权限并调用 tlb_set_page() 写入映射。</w:t>
+      </w:r>
+    </w:p>
+    <w:p>
+      <w:pPr>
         <w:pStyle w:val="2"/>
         <w:keepNext w:val="0"/>
         <w:keepLines w:val="0"/>
@@ -6432,6 +7312,20 @@
     </w:p>
     <w:p>
       <w:pPr>
+        <w:spacing w:before="60" w:after="80"/>
+        <w:ind w:firstLine="420"/>
+      </w:pPr>
+      <w:r>
+        <w:rPr>
+          <w:sz w:val="21"/>
+          <w:szCs w:val="21"/>
+          <w:rFonts w:ascii="宋体" w:hAnsi="宋体" w:eastAsia="宋体"/>
+        </w:rPr>
+        <w:t>步骤 57：查看 get_physical_address() 的逐级页表遍历代码，并在 PTE 地址计算处停下。每一级通过 idx 计算 pte_addr，再读取对应 PTE。</w:t>
+      </w:r>
+    </w:p>
+    <w:p>
+      <w:pPr>
         <w:pStyle w:val="2"/>
         <w:keepNext w:val="0"/>
         <w:keepLines w:val="0"/>
@@ -6498,6 +7392,20 @@
     </w:p>
     <w:p>
       <w:pPr>
+        <w:spacing w:before="60" w:after="80"/>
+        <w:ind w:firstLine="420"/>
+      </w:pPr>
+      <w:r>
+        <w:rPr>
+          <w:sz w:val="21"/>
+          <w:szCs w:val="21"/>
+          <w:rFonts w:ascii="宋体" w:hAnsi="宋体" w:eastAsia="宋体"/>
+        </w:rPr>
+        <w:t>步骤 58：打印 i、levels、base、idx、pte_addr 和 pte。以这些实测变量核对虚拟地址 VPN 索引、根页表基址和 PTE 内容是否一致。</w:t>
+      </w:r>
+    </w:p>
+    <w:p>
+      <w:pPr>
         <w:pStyle w:val="2"/>
         <w:keepNext w:val="0"/>
         <w:keepLines w:val="0"/>
@@ -6564,6 +7472,20 @@
     </w:p>
     <w:p>
       <w:pPr>
+        <w:spacing w:before="60" w:after="80"/>
+        <w:ind w:firstLine="420"/>
+      </w:pPr>
+      <w:r>
+        <w:rPr>
+          <w:sz w:val="21"/>
+          <w:szCs w:val="21"/>
+          <w:rFonts w:ascii="宋体" w:hAnsi="宋体" w:eastAsia="宋体"/>
+        </w:rPr>
+        <w:t>步骤 59：检查 PTE 的标志位及页内偏移计算后从 get_physical_address() 返回。该步骤用于观察页表遍历结束时的中间状态与控制流返回。</w:t>
+      </w:r>
+    </w:p>
+    <w:p>
+      <w:pPr>
         <w:pStyle w:val="2"/>
         <w:keepNext w:val="0"/>
         <w:keepLines w:val="0"/>
@@ -6630,6 +7552,20 @@
     </w:p>
     <w:p>
       <w:pPr>
+        <w:spacing w:before="60" w:after="80"/>
+        <w:ind w:firstLine="420"/>
+      </w:pPr>
+      <w:r>
+        <w:rPr>
+          <w:sz w:val="21"/>
+          <w:szCs w:val="21"/>
+          <w:rFonts w:ascii="宋体" w:hAnsi="宋体" w:eastAsia="宋体"/>
+        </w:rPr>
+        <w:t>步骤 60：在 tlb_set_page() 调用前检查虚拟地址、物理地址和保护权限。只有地址和权限都正确，QEMU 才能建立可用 TLB 条目。</w:t>
+      </w:r>
+    </w:p>
+    <w:p>
+      <w:pPr>
         <w:pStyle w:val="2"/>
         <w:keepNext w:val="0"/>
         <w:keepLines w:val="0"/>
@@ -6696,6 +7632,20 @@
     </w:p>
     <w:p>
       <w:pPr>
+        <w:spacing w:before="60" w:after="80"/>
+        <w:ind w:firstLine="420"/>
+      </w:pPr>
+      <w:r>
+        <w:rPr>
+          <w:sz w:val="21"/>
+          <w:szCs w:val="21"/>
+          <w:rFonts w:ascii="宋体" w:hAnsi="宋体" w:eastAsia="宋体"/>
+        </w:rPr>
+        <w:t>步骤 61：单步进入 tlb_set_page() 并打印 vaddr、paddr、prot、mmu_idx、size。该步骤验证翻译结果怎样被传递给 QEMU 的 TLB 子系统。</w:t>
+      </w:r>
+    </w:p>
+    <w:p>
+      <w:pPr>
         <w:pStyle w:val="2"/>
         <w:keepNext w:val="0"/>
         <w:keepLines w:val="0"/>
@@ -6762,6 +7712,20 @@
     </w:p>
     <w:p>
       <w:pPr>
+        <w:spacing w:before="60" w:after="80"/>
+        <w:ind w:firstLine="420"/>
+      </w:pPr>
+      <w:r>
+        <w:rPr>
+          <w:sz w:val="21"/>
+          <w:szCs w:val="21"/>
+          <w:rFonts w:ascii="宋体" w:hAnsi="宋体" w:eastAsia="宋体"/>
+        </w:rPr>
+        <w:t>步骤 62：继续查看 tlb_set_page() 内部调用关系及返回路径。通过调用栈确认翻译结果已经从 RISC-V CPU 辅助函数交给 TLB 映射层。</w:t>
+      </w:r>
+    </w:p>
+    <w:p>
+      <w:pPr>
         <w:pStyle w:val="2"/>
         <w:keepNext w:val="0"/>
         <w:keepLines w:val="0"/>
@@ -6824,6 +7788,20 @@
           <w:szCs w:val="21"/>
         </w:rPr>
         <w:t>图 62：继续查看 tlb_set_page() 内的参数和调用关系。用于确认已得到的翻译结果被交给 QEMU TLB 子系统。</w:t>
+      </w:r>
+    </w:p>
+    <w:p>
+      <w:pPr>
+        <w:spacing w:before="60" w:after="80"/>
+        <w:ind w:firstLine="420"/>
+      </w:pPr>
+      <w:r>
+        <w:rPr>
+          <w:sz w:val="21"/>
+          <w:szCs w:val="21"/>
+          <w:rFonts w:ascii="宋体" w:hAnsi="宋体" w:eastAsia="宋体"/>
+        </w:rPr>
+        <w:t>步骤 63：结束当前 riscv_cpu_tlb_fill() 调用并读取返回值 false。报告保留这一实际结果，用于说明本次被观察的访问并未以成功 TLB 映射结束。</w:t>
       </w:r>
     </w:p>
     <w:p>

</xml_diff>

<commit_message>
docs(lab2): simplify and center figure captions
</commit_message>
<xml_diff>
--- a/report/member-b/实验二_乙_最终版.docx
+++ b/report/member-b/实验二_乙_最终版.docx
@@ -772,14 +772,15 @@
     <w:p>
       <w:pPr>
         <w:spacing w:before="0" w:after="80"/>
-      </w:pPr>
-      <w:r>
-        <w:rPr>
-          <w:rFonts w:ascii="宋体" w:hAnsi="宋体" w:eastAsia="宋体" w:cs="宋体"/>
-          <w:sz w:val="21"/>
-          <w:szCs w:val="21"/>
-        </w:rPr>
-        <w:t>图 1：终端单独编译 Best-Fit 物理页分配器源码。用于检查 best_fit_pmm.c 的接口、头文件引用和 RISC-V 交叉编译结果均正常。</w:t>
+        <w:jc w:val="center"/>
+      </w:pPr>
+      <w:r>
+        <w:rPr>
+          <w:rFonts w:ascii="宋体" w:hAnsi="宋体" w:eastAsia="宋体" w:cs="宋体"/>
+          <w:sz w:val="18"/>
+          <w:szCs w:val="18"/>
+        </w:rPr>
+        <w:t>图 1：Best-Fit 单文件编译</w:t>
       </w:r>
     </w:p>
     <w:p>
@@ -1319,14 +1320,15 @@
     <w:p>
       <w:pPr>
         <w:spacing w:before="0" w:after="80"/>
-      </w:pPr>
-      <w:r>
-        <w:rPr>
-          <w:rFonts w:ascii="宋体" w:hAnsi="宋体" w:eastAsia="宋体" w:cs="宋体"/>
-          <w:sz w:val="21"/>
-          <w:szCs w:val="21"/>
-        </w:rPr>
-        <w:t>图 2：终端单独编译 SLUB 分配器及初始化调用相关源码。用于检查 slub.c、slub.h 与内核初始化接口能够正确衔接。</w:t>
+        <w:jc w:val="center"/>
+      </w:pPr>
+      <w:r>
+        <w:rPr>
+          <w:rFonts w:ascii="宋体" w:hAnsi="宋体" w:eastAsia="宋体" w:cs="宋体"/>
+          <w:sz w:val="18"/>
+          <w:szCs w:val="18"/>
+        </w:rPr>
+        <w:t>图 2：SLUB 单文件编译</w:t>
       </w:r>
     </w:p>
     <w:p>
@@ -1838,14 +1840,15 @@
     <w:p>
       <w:pPr>
         <w:spacing w:before="0" w:after="80"/>
-      </w:pPr>
-      <w:r>
-        <w:rPr>
-          <w:rFonts w:ascii="宋体" w:hAnsi="宋体" w:eastAsia="宋体" w:cs="宋体"/>
-          <w:sz w:val="21"/>
-          <w:szCs w:val="21"/>
-        </w:rPr>
-        <w:t>图 3：终端单独编译 SLUB 测试模块。用于检查 slub_test.c 对分配器接口的调用、断言依赖和编译链接关系正确。</w:t>
+        <w:jc w:val="center"/>
+      </w:pPr>
+      <w:r>
+        <w:rPr>
+          <w:rFonts w:ascii="宋体" w:hAnsi="宋体" w:eastAsia="宋体" w:cs="宋体"/>
+          <w:sz w:val="18"/>
+          <w:szCs w:val="18"/>
+        </w:rPr>
+        <w:t>图 3：SLUB 测试模块编译</w:t>
       </w:r>
     </w:p>
     <w:p>
@@ -2682,10 +2685,10 @@
       <w:r>
         <w:rPr>
           <w:rFonts w:ascii="宋体" w:hAnsi="宋体" w:eastAsia="宋体" w:cs="宋体"/>
-          <w:sz w:val="21"/>
-          <w:i/>
-        </w:rPr>
-        <w:t>图：VS Code 终端完成内核编译</w:t>
+          <w:sz w:val="18"/>
+          <w:szCs w:val="18"/>
+        </w:rPr>
+        <w:t>图 4：VS Code 内核完整编译</w:t>
       </w:r>
     </w:p>
     <w:p>
@@ -2773,10 +2776,10 @@
       <w:r>
         <w:rPr>
           <w:rFonts w:ascii="宋体" w:hAnsi="宋体" w:eastAsia="宋体" w:cs="宋体"/>
-          <w:sz w:val="21"/>
-          <w:i/>
-        </w:rPr>
-        <w:t>图：VS Code 中 Best-Fit 分配函数断点与调用栈</w:t>
+          <w:sz w:val="18"/>
+          <w:szCs w:val="18"/>
+        </w:rPr>
+        <w:t>图 5：Best-Fit GDB 调试</w:t>
       </w:r>
     </w:p>
     <w:p>
@@ -2864,10 +2867,10 @@
       <w:r>
         <w:rPr>
           <w:rFonts w:ascii="宋体" w:hAnsi="宋体" w:eastAsia="宋体" w:cs="宋体"/>
-          <w:sz w:val="21"/>
-          <w:i/>
-        </w:rPr>
-        <w:t>图：VS Code 中 SLUB 边界与内存耗尽测试</w:t>
+          <w:sz w:val="18"/>
+          <w:szCs w:val="18"/>
+        </w:rPr>
+        <w:t>图 6：SLUB 边界与耗尽测试</w:t>
       </w:r>
     </w:p>
     <w:p>
@@ -2955,10 +2958,10 @@
       <w:r>
         <w:rPr>
           <w:rFonts w:ascii="宋体" w:hAnsi="宋体" w:eastAsia="宋体" w:cs="宋体"/>
-          <w:sz w:val="21"/>
-          <w:i/>
-        </w:rPr>
-        <w:t>图：VS Code 终端中的 QEMU 内核启动与分配器检查</w:t>
+          <w:sz w:val="18"/>
+          <w:szCs w:val="18"/>
+        </w:rPr>
+        <w:t>图 7：QEMU 启动及分配器检查</w:t>
       </w:r>
     </w:p>
     <w:p>
@@ -3046,10 +3049,10 @@
       <w:r>
         <w:rPr>
           <w:rFonts w:ascii="宋体" w:hAnsi="宋体" w:eastAsia="宋体" w:cs="宋体"/>
-          <w:sz w:val="21"/>
-          <w:i/>
-        </w:rPr>
-        <w:t>图：VS Code 终端中的 make grade 结果</w:t>
+          <w:sz w:val="18"/>
+          <w:szCs w:val="18"/>
+        </w:rPr>
+        <w:t>图 8：make grade 评分结果</w:t>
       </w:r>
     </w:p>
     <w:p>
@@ -3124,10 +3127,10 @@
       <w:r>
         <w:rPr>
           <w:rFonts w:ascii="宋体" w:hAnsi="宋体" w:eastAsia="宋体" w:cs="宋体"/>
-          <w:sz w:val="21"/>
-          <w:i/>
-        </w:rPr>
-        <w:t>图：VS Code 终端中的 Page Init 与 Buddy 回归检查</w:t>
+          <w:sz w:val="18"/>
+          <w:szCs w:val="18"/>
+        </w:rPr>
+        <w:t>图 9：Page Init 与 Buddy 回归检查</w:t>
       </w:r>
     </w:p>
     <w:p>
@@ -3219,14 +3222,15 @@
     <w:p>
       <w:pPr>
         <w:spacing w:before="0" w:after="80"/>
-      </w:pPr>
-      <w:r>
-        <w:rPr>
-          <w:rFonts w:ascii="宋体" w:hAnsi="宋体" w:eastAsia="宋体" w:cs="宋体"/>
-          <w:sz w:val="21"/>
-          <w:szCs w:val="21"/>
-        </w:rPr>
-        <w:t>图 4：再次单独构建 slub_test.o 测试模块。用于确认 SLUB 测试文件可独立通过编译，且未引入新的依赖错误。</w:t>
+        <w:jc w:val="center"/>
+      </w:pPr>
+      <w:r>
+        <w:rPr>
+          <w:rFonts w:ascii="宋体" w:hAnsi="宋体" w:eastAsia="宋体" w:cs="宋体"/>
+          <w:sz w:val="18"/>
+          <w:szCs w:val="18"/>
+        </w:rPr>
+        <w:t>图 10：SLUB 测试模块复编译</w:t>
       </w:r>
     </w:p>
     <w:p>
@@ -3302,14 +3306,15 @@
     <w:p>
       <w:pPr>
         <w:spacing w:before="0" w:after="80"/>
-      </w:pPr>
-      <w:r>
-        <w:rPr>
-          <w:rFonts w:ascii="宋体" w:hAnsi="宋体" w:eastAsia="宋体" w:cs="宋体"/>
-          <w:sz w:val="21"/>
-          <w:szCs w:val="21"/>
-        </w:rPr>
-        <w:t>图 5：查看 pmm.c 的 init_pmm_manager()、page_init() 位置并检查 Git 状态。用于确认物理页管理器注册与 page_init 调用位置，同时核对工作区。</w:t>
+        <w:jc w:val="center"/>
+      </w:pPr>
+      <w:r>
+        <w:rPr>
+          <w:rFonts w:ascii="宋体" w:hAnsi="宋体" w:eastAsia="宋体" w:cs="宋体"/>
+          <w:sz w:val="18"/>
+          <w:szCs w:val="18"/>
+        </w:rPr>
+        <w:t>图 11：pmm.c 初始化位置</w:t>
       </w:r>
     </w:p>
     <w:p>
@@ -3385,14 +3390,15 @@
     <w:p>
       <w:pPr>
         <w:spacing w:before="0" w:after="80"/>
-      </w:pPr>
-      <w:r>
-        <w:rPr>
-          <w:rFonts w:ascii="宋体" w:hAnsi="宋体" w:eastAsia="宋体" w:cs="宋体"/>
-          <w:sz w:val="21"/>
-          <w:szCs w:val="21"/>
-        </w:rPr>
-        <w:t>图 6：查看 pmm.c 中 page_init 的 YOUR CODE 区域和 pmm_init() 流程。用于确认 page_init 已接入物理页管理初始化并保留实验标记。</w:t>
+        <w:jc w:val="center"/>
+      </w:pPr>
+      <w:r>
+        <w:rPr>
+          <w:rFonts w:ascii="宋体" w:hAnsi="宋体" w:eastAsia="宋体" w:cs="宋体"/>
+          <w:sz w:val="18"/>
+          <w:szCs w:val="18"/>
+        </w:rPr>
+        <w:t>图 12：page_init 与 pmm_init</w:t>
       </w:r>
     </w:p>
     <w:p>
@@ -3471,14 +3477,15 @@
     <w:p>
       <w:pPr>
         <w:spacing w:before="0" w:after="80"/>
-      </w:pPr>
-      <w:r>
-        <w:rPr>
-          <w:rFonts w:ascii="宋体" w:hAnsi="宋体" w:eastAsia="宋体" w:cs="宋体"/>
-          <w:sz w:val="21"/>
-          <w:szCs w:val="21"/>
-        </w:rPr>
-        <w:t>图 7：查看集成工程中的文件状态。用于复核新增测试、调试记录和实验报告材料没有遗漏。</w:t>
+        <w:jc w:val="center"/>
+      </w:pPr>
+      <w:r>
+        <w:rPr>
+          <w:rFonts w:ascii="宋体" w:hAnsi="宋体" w:eastAsia="宋体" w:cs="宋体"/>
+          <w:sz w:val="18"/>
+          <w:szCs w:val="18"/>
+        </w:rPr>
+        <w:t>图 13：工程文件状态</w:t>
       </w:r>
     </w:p>
     <w:p>
@@ -3554,14 +3561,15 @@
     <w:p>
       <w:pPr>
         <w:spacing w:before="0" w:after="80"/>
-      </w:pPr>
-      <w:r>
-        <w:rPr>
-          <w:rFonts w:ascii="宋体" w:hAnsi="宋体" w:eastAsia="宋体" w:cs="宋体"/>
-          <w:sz w:val="21"/>
-          <w:szCs w:val="21"/>
-        </w:rPr>
-        <w:t>图 8：查看 Git 状态的后续输出。用于确认本次实验不包含对评分脚本和无关文件的意外修改。</w:t>
+        <w:jc w:val="center"/>
+      </w:pPr>
+      <w:r>
+        <w:rPr>
+          <w:rFonts w:ascii="宋体" w:hAnsi="宋体" w:eastAsia="宋体" w:cs="宋体"/>
+          <w:sz w:val="18"/>
+          <w:szCs w:val="18"/>
+        </w:rPr>
+        <w:t>图 14：Git 状态续页</w:t>
       </w:r>
     </w:p>
     <w:p>
@@ -3637,14 +3645,15 @@
     <w:p>
       <w:pPr>
         <w:spacing w:before="0" w:after="80"/>
-      </w:pPr>
-      <w:r>
-        <w:rPr>
-          <w:rFonts w:ascii="宋体" w:hAnsi="宋体" w:eastAsia="宋体" w:cs="宋体"/>
-          <w:sz w:val="21"/>
-          <w:szCs w:val="21"/>
-        </w:rPr>
-        <w:t>图 9：查看工程文件与版本控制记录。用于为后续构建、运行和提交前的文件一致性检查提供依据。</w:t>
+        <w:jc w:val="center"/>
+      </w:pPr>
+      <w:r>
+        <w:rPr>
+          <w:rFonts w:ascii="宋体" w:hAnsi="宋体" w:eastAsia="宋体" w:cs="宋体"/>
+          <w:sz w:val="18"/>
+          <w:szCs w:val="18"/>
+        </w:rPr>
+        <w:t>图 15：工作区版本状态</w:t>
       </w:r>
     </w:p>
     <w:p>
@@ -3720,14 +3729,15 @@
     <w:p>
       <w:pPr>
         <w:spacing w:before="0" w:after="80"/>
-      </w:pPr>
-      <w:r>
-        <w:rPr>
-          <w:rFonts w:ascii="宋体" w:hAnsi="宋体" w:eastAsia="宋体" w:cs="宋体"/>
-          <w:sz w:val="21"/>
-          <w:szCs w:val="21"/>
-        </w:rPr>
-        <w:t>图 10：执行 clean 后的完整内核构建。用于验证 Best-Fit、SLUB、Buddy 等模块能够随工程一起通过编译。</w:t>
+        <w:jc w:val="center"/>
+      </w:pPr>
+      <w:r>
+        <w:rPr>
+          <w:rFonts w:ascii="宋体" w:hAnsi="宋体" w:eastAsia="宋体" w:cs="宋体"/>
+          <w:sz w:val="18"/>
+          <w:szCs w:val="18"/>
+        </w:rPr>
+        <w:t>图 16：完整内核构建</w:t>
       </w:r>
     </w:p>
     <w:p>
@@ -3803,14 +3813,15 @@
     <w:p>
       <w:pPr>
         <w:spacing w:before="0" w:after="80"/>
-      </w:pPr>
-      <w:r>
-        <w:rPr>
-          <w:rFonts w:ascii="宋体" w:hAnsi="宋体" w:eastAsia="宋体" w:cs="宋体"/>
-          <w:sz w:val="21"/>
-          <w:szCs w:val="21"/>
-        </w:rPr>
-        <w:t>图 11：执行 make qemu 后的内核启动日志。用于检查 OpenSBI 启动、物理页管理器初始化和 SLUB 自检过程能够正常完成。</w:t>
+        <w:jc w:val="center"/>
+      </w:pPr>
+      <w:r>
+        <w:rPr>
+          <w:rFonts w:ascii="宋体" w:hAnsi="宋体" w:eastAsia="宋体" w:cs="宋体"/>
+          <w:sz w:val="18"/>
+          <w:szCs w:val="18"/>
+        </w:rPr>
+        <w:t>图 17：QEMU 内核启动</w:t>
       </w:r>
     </w:p>
     <w:p>
@@ -3886,14 +3897,15 @@
     <w:p>
       <w:pPr>
         <w:spacing w:before="0" w:after="80"/>
-      </w:pPr>
-      <w:r>
-        <w:rPr>
-          <w:rFonts w:ascii="宋体" w:hAnsi="宋体" w:eastAsia="宋体" w:cs="宋体"/>
-          <w:sz w:val="21"/>
-          <w:szCs w:val="21"/>
-        </w:rPr>
-        <w:t>图 12：执行 make grade 的评分输出。用于验证 Page Init 与 Best-Fit 的基础检查通过，并记录评分结果。</w:t>
+        <w:jc w:val="center"/>
+      </w:pPr>
+      <w:r>
+        <w:rPr>
+          <w:rFonts w:ascii="宋体" w:hAnsi="宋体" w:eastAsia="宋体" w:cs="宋体"/>
+          <w:sz w:val="18"/>
+          <w:szCs w:val="18"/>
+        </w:rPr>
+        <w:t>图 18：make grade 评分</w:t>
       </w:r>
     </w:p>
     <w:p>
@@ -4016,14 +4028,15 @@
     <w:p>
       <w:pPr>
         <w:spacing w:before="0" w:after="80"/>
-      </w:pPr>
-      <w:r>
-        <w:rPr>
-          <w:rFonts w:ascii="宋体" w:hAnsi="宋体" w:eastAsia="宋体" w:cs="宋体"/>
-          <w:sz w:val="21"/>
-          <w:szCs w:val="21"/>
-        </w:rPr>
-        <w:t>图 13：构建包含调试信息的内核镜像。用于为 QEMU 和 GDB 联合调试准备带符号的可执行文件。</w:t>
+        <w:jc w:val="center"/>
+      </w:pPr>
+      <w:r>
+        <w:rPr>
+          <w:rFonts w:ascii="宋体" w:hAnsi="宋体" w:eastAsia="宋体" w:cs="宋体"/>
+          <w:sz w:val="18"/>
+          <w:szCs w:val="18"/>
+        </w:rPr>
+        <w:t>图 19：调试内核构建</w:t>
       </w:r>
     </w:p>
     <w:p>
@@ -4099,14 +4112,15 @@
     <w:p>
       <w:pPr>
         <w:spacing w:before="0" w:after="80"/>
-      </w:pPr>
-      <w:r>
-        <w:rPr>
-          <w:rFonts w:ascii="宋体" w:hAnsi="宋体" w:eastAsia="宋体" w:cs="宋体"/>
-          <w:sz w:val="21"/>
-          <w:szCs w:val="21"/>
-        </w:rPr>
-        <w:t>图 14：查看 VS Code 转发的 1234 调试端口。用于确认 QEMU 的远程 GDB 端口已经处于可连接状态。</w:t>
+        <w:jc w:val="center"/>
+      </w:pPr>
+      <w:r>
+        <w:rPr>
+          <w:rFonts w:ascii="宋体" w:hAnsi="宋体" w:eastAsia="宋体" w:cs="宋体"/>
+          <w:sz w:val="18"/>
+          <w:szCs w:val="18"/>
+        </w:rPr>
+        <w:t>图 20：VS Code 调试端口</w:t>
       </w:r>
     </w:p>
     <w:p>
@@ -4182,14 +4196,15 @@
     <w:p>
       <w:pPr>
         <w:spacing w:before="0" w:after="80"/>
-      </w:pPr>
-      <w:r>
-        <w:rPr>
-          <w:rFonts w:ascii="宋体" w:hAnsi="宋体" w:eastAsia="宋体" w:cs="宋体"/>
-          <w:sz w:val="21"/>
-          <w:szCs w:val="21"/>
-        </w:rPr>
-        <w:t>图 15：RISC-V GDB 连接 localhost:1234 的输出。用于验证宿主机调试器可以附加到 QEMU 中运行的内核。</w:t>
+        <w:jc w:val="center"/>
+      </w:pPr>
+      <w:r>
+        <w:rPr>
+          <w:rFonts w:ascii="宋体" w:hAnsi="宋体" w:eastAsia="宋体" w:cs="宋体"/>
+          <w:sz w:val="18"/>
+          <w:szCs w:val="18"/>
+        </w:rPr>
+        <w:t>图 21：RISC-V GDB 连接</w:t>
       </w:r>
     </w:p>
     <w:p>
@@ -4265,14 +4280,15 @@
     <w:p>
       <w:pPr>
         <w:spacing w:before="0" w:after="80"/>
-      </w:pPr>
-      <w:r>
-        <w:rPr>
-          <w:rFonts w:ascii="宋体" w:hAnsi="宋体" w:eastAsia="宋体" w:cs="宋体"/>
-          <w:sz w:val="21"/>
-          <w:szCs w:val="21"/>
-        </w:rPr>
-        <w:t>图 16：在 kern_init() 设置并命中断点。用于确认内核入口位置可被稳定调试和单步观察。</w:t>
+        <w:jc w:val="center"/>
+      </w:pPr>
+      <w:r>
+        <w:rPr>
+          <w:rFonts w:ascii="宋体" w:hAnsi="宋体" w:eastAsia="宋体" w:cs="宋体"/>
+          <w:sz w:val="18"/>
+          <w:szCs w:val="18"/>
+        </w:rPr>
+        <w:t>图 22：kern_init 断点</w:t>
       </w:r>
     </w:p>
     <w:p>
@@ -4348,14 +4364,15 @@
     <w:p>
       <w:pPr>
         <w:spacing w:before="0" w:after="80"/>
-      </w:pPr>
-      <w:r>
-        <w:rPr>
-          <w:rFonts w:ascii="宋体" w:hAnsi="宋体" w:eastAsia="宋体" w:cs="宋体"/>
-          <w:sz w:val="21"/>
-          <w:szCs w:val="21"/>
-        </w:rPr>
-        <w:t>图 17：再次显示调试版内核构建过程。用于确认调试会话使用的是带符号信息且与当前源码一致的镜像。</w:t>
+        <w:jc w:val="center"/>
+      </w:pPr>
+      <w:r>
+        <w:rPr>
+          <w:rFonts w:ascii="宋体" w:hAnsi="宋体" w:eastAsia="宋体" w:cs="宋体"/>
+          <w:sz w:val="18"/>
+          <w:szCs w:val="18"/>
+        </w:rPr>
+        <w:t>图 23：调试构建与 QEMU 启动</w:t>
       </w:r>
     </w:p>
     <w:p>
@@ -4431,14 +4448,15 @@
     <w:p>
       <w:pPr>
         <w:spacing w:before="0" w:after="80"/>
-      </w:pPr>
-      <w:r>
-        <w:rPr>
-          <w:rFonts w:ascii="宋体" w:hAnsi="宋体" w:eastAsia="宋体" w:cs="宋体"/>
-          <w:sz w:val="21"/>
-          <w:szCs w:val="21"/>
-        </w:rPr>
-        <w:t>图 18：在 GDB 中读取 PC、satp、反汇编和调用栈。用于确认当前执行位置以及 Sv39 页表寄存器状态。</w:t>
+        <w:jc w:val="center"/>
+      </w:pPr>
+      <w:r>
+        <w:rPr>
+          <w:rFonts w:ascii="宋体" w:hAnsi="宋体" w:eastAsia="宋体" w:cs="宋体"/>
+          <w:sz w:val="18"/>
+          <w:szCs w:val="18"/>
+        </w:rPr>
+        <w:t>图 24：PC 与 satp</w:t>
       </w:r>
     </w:p>
     <w:p>
@@ -4514,14 +4532,15 @@
     <w:p>
       <w:pPr>
         <w:spacing w:before="0" w:after="80"/>
-      </w:pPr>
-      <w:r>
-        <w:rPr>
-          <w:rFonts w:ascii="宋体" w:hAnsi="宋体" w:eastAsia="宋体" w:cs="宋体"/>
-          <w:sz w:val="21"/>
-          <w:szCs w:val="21"/>
-        </w:rPr>
-        <w:t>图 19：在 pmm_init() 设置并命中断点。用于验证物理内存管理初始化由内核启动流程正确调用。</w:t>
+        <w:jc w:val="center"/>
+      </w:pPr>
+      <w:r>
+        <w:rPr>
+          <w:rFonts w:ascii="宋体" w:hAnsi="宋体" w:eastAsia="宋体" w:cs="宋体"/>
+          <w:sz w:val="18"/>
+          <w:szCs w:val="18"/>
+        </w:rPr>
+        <w:t>图 25：pmm_init 断点</w:t>
       </w:r>
     </w:p>
     <w:p>
@@ -4601,14 +4620,15 @@
     <w:p>
       <w:pPr>
         <w:spacing w:before="0" w:after="80"/>
-      </w:pPr>
-      <w:r>
-        <w:rPr>
-          <w:rFonts w:ascii="宋体" w:hAnsi="宋体" w:eastAsia="宋体" w:cs="宋体"/>
-          <w:sz w:val="21"/>
-          <w:szCs w:val="21"/>
-        </w:rPr>
-        <w:t>图 20：QEMU 启动阶段的串口输出。用于记录设备树提供的内存范围以及内核进入物理页管理初始化前的状态。</w:t>
+        <w:jc w:val="center"/>
+      </w:pPr>
+      <w:r>
+        <w:rPr>
+          <w:rFonts w:ascii="宋体" w:hAnsi="宋体" w:eastAsia="宋体" w:cs="宋体"/>
+          <w:sz w:val="18"/>
+          <w:szCs w:val="18"/>
+        </w:rPr>
+        <w:t>图 26：QEMU 内存布局</w:t>
       </w:r>
     </w:p>
     <w:p>
@@ -4684,14 +4704,15 @@
     <w:p>
       <w:pPr>
         <w:spacing w:before="0" w:after="80"/>
-      </w:pPr>
-      <w:r>
-        <w:rPr>
-          <w:rFonts w:ascii="宋体" w:hAnsi="宋体" w:eastAsia="宋体" w:cs="宋体"/>
-          <w:sz w:val="21"/>
-          <w:szCs w:val="21"/>
-        </w:rPr>
-        <w:t>图 21：查看 pmm_init() 附近的寄存器、调用栈和源码。用于核对 page_init 前后的初始化顺序。</w:t>
+        <w:jc w:val="center"/>
+      </w:pPr>
+      <w:r>
+        <w:rPr>
+          <w:rFonts w:ascii="宋体" w:hAnsi="宋体" w:eastAsia="宋体" w:cs="宋体"/>
+          <w:sz w:val="18"/>
+          <w:szCs w:val="18"/>
+        </w:rPr>
+        <w:t>图 27：pmm_init 源码</w:t>
       </w:r>
     </w:p>
     <w:p>
@@ -4767,14 +4788,15 @@
     <w:p>
       <w:pPr>
         <w:spacing w:before="0" w:after="80"/>
-      </w:pPr>
-      <w:r>
-        <w:rPr>
-          <w:rFonts w:ascii="宋体" w:hAnsi="宋体" w:eastAsia="宋体" w:cs="宋体"/>
-          <w:sz w:val="21"/>
-          <w:szCs w:val="21"/>
-        </w:rPr>
-        <w:t>图 22：命中 Best-Fit 页面分配函数的断点。用于验证基础检查实际进入了 Best-Fit 分配路径。</w:t>
+        <w:jc w:val="center"/>
+      </w:pPr>
+      <w:r>
+        <w:rPr>
+          <w:rFonts w:ascii="宋体" w:hAnsi="宋体" w:eastAsia="宋体" w:cs="宋体"/>
+          <w:sz w:val="18"/>
+          <w:szCs w:val="18"/>
+        </w:rPr>
+        <w:t>图 28：Best-Fit 分配断点</w:t>
       </w:r>
     </w:p>
     <w:p>
@@ -4850,14 +4872,15 @@
     <w:p>
       <w:pPr>
         <w:spacing w:before="0" w:after="80"/>
-      </w:pPr>
-      <w:r>
-        <w:rPr>
-          <w:rFonts w:ascii="宋体" w:hAnsi="宋体" w:eastAsia="宋体" w:cs="宋体"/>
-          <w:sz w:val="21"/>
-          <w:szCs w:val="21"/>
-        </w:rPr>
-        <w:t>图 23：查看 Best-Fit 分配器运行时的 QEMU 输出。用于确认当前普通实验配置使用了 Best-Fit 管理器。</w:t>
+        <w:jc w:val="center"/>
+      </w:pPr>
+      <w:r>
+        <w:rPr>
+          <w:rFonts w:ascii="宋体" w:hAnsi="宋体" w:eastAsia="宋体" w:cs="宋体"/>
+          <w:sz w:val="18"/>
+          <w:szCs w:val="18"/>
+        </w:rPr>
+        <w:t>图 29：Best-Fit QEMU 输出</w:t>
       </w:r>
     </w:p>
     <w:p>
@@ -4933,14 +4956,15 @@
     <w:p>
       <w:pPr>
         <w:spacing w:before="0" w:after="80"/>
-      </w:pPr>
-      <w:r>
-        <w:rPr>
-          <w:rFonts w:ascii="宋体" w:hAnsi="宋体" w:eastAsia="宋体" w:cs="宋体"/>
-          <w:sz w:val="21"/>
-          <w:szCs w:val="21"/>
-        </w:rPr>
-        <w:t>图 24：查看 Best-Fit 分配函数的调用栈。用于核对 basic_check()、best_fit_check() 和 pmm_init() 的调用关系。</w:t>
+        <w:jc w:val="center"/>
+      </w:pPr>
+      <w:r>
+        <w:rPr>
+          <w:rFonts w:ascii="宋体" w:hAnsi="宋体" w:eastAsia="宋体" w:cs="宋体"/>
+          <w:sz w:val="18"/>
+          <w:szCs w:val="18"/>
+        </w:rPr>
+        <w:t>图 30：Best-Fit 调用栈</w:t>
       </w:r>
     </w:p>
     <w:p>
@@ -5016,14 +5040,15 @@
     <w:p>
       <w:pPr>
         <w:spacing w:before="0" w:after="80"/>
-      </w:pPr>
-      <w:r>
-        <w:rPr>
-          <w:rFonts w:ascii="宋体" w:hAnsi="宋体" w:eastAsia="宋体" w:cs="宋体"/>
-          <w:sz w:val="21"/>
-          <w:szCs w:val="21"/>
-        </w:rPr>
-        <w:t>图 25：查看 Best-Fit 分配与释放的源码位置。用于检查最小空闲块选择、块拆分、相邻块合并和链表维护逻辑。</w:t>
+        <w:jc w:val="center"/>
+      </w:pPr>
+      <w:r>
+        <w:rPr>
+          <w:rFonts w:ascii="宋体" w:hAnsi="宋体" w:eastAsia="宋体" w:cs="宋体"/>
+          <w:sz w:val="18"/>
+          <w:szCs w:val="18"/>
+        </w:rPr>
+        <w:t>图 31：Best-Fit 分配与释放源码</w:t>
       </w:r>
     </w:p>
     <w:p>
@@ -5099,14 +5124,15 @@
     <w:p>
       <w:pPr>
         <w:spacing w:before="0" w:after="80"/>
-      </w:pPr>
-      <w:r>
-        <w:rPr>
-          <w:rFonts w:ascii="宋体" w:hAnsi="宋体" w:eastAsia="宋体" w:cs="宋体"/>
-          <w:sz w:val="21"/>
-          <w:szCs w:val="21"/>
-        </w:rPr>
-        <w:t>图 26：在 slub_alloc() 的零大小申请分支处调试。用于验证 size 为 0 时分配器按约定返回 NULL。</w:t>
+        <w:jc w:val="center"/>
+      </w:pPr>
+      <w:r>
+        <w:rPr>
+          <w:rFonts w:ascii="宋体" w:hAnsi="宋体" w:eastAsia="宋体" w:cs="宋体"/>
+          <w:sz w:val="18"/>
+          <w:szCs w:val="18"/>
+        </w:rPr>
+        <w:t>图 32：SLUB 零大小请求</w:t>
       </w:r>
     </w:p>
     <w:p>
@@ -5182,14 +5208,15 @@
     <w:p>
       <w:pPr>
         <w:spacing w:before="0" w:after="80"/>
-      </w:pPr>
-      <w:r>
-        <w:rPr>
-          <w:rFonts w:ascii="宋体" w:hAnsi="宋体" w:eastAsia="宋体" w:cs="宋体"/>
-          <w:sz w:val="21"/>
-          <w:szCs w:val="21"/>
-        </w:rPr>
-        <w:t>图 27：查看 SLUB 测试运行期间的 QEMU 输出。用于确认对象分配测试已随内核启动流程被调用。</w:t>
+        <w:jc w:val="center"/>
+      </w:pPr>
+      <w:r>
+        <w:rPr>
+          <w:rFonts w:ascii="宋体" w:hAnsi="宋体" w:eastAsia="宋体" w:cs="宋体"/>
+          <w:sz w:val="18"/>
+          <w:szCs w:val="18"/>
+        </w:rPr>
+        <w:t>图 33：SLUB QEMU 输出</w:t>
       </w:r>
     </w:p>
     <w:p>
@@ -5265,14 +5292,15 @@
     <w:p>
       <w:pPr>
         <w:spacing w:before="0" w:after="80"/>
-      </w:pPr>
-      <w:r>
-        <w:rPr>
-          <w:rFonts w:ascii="宋体" w:hAnsi="宋体" w:eastAsia="宋体" w:cs="宋体"/>
-          <w:sz w:val="21"/>
-          <w:szCs w:val="21"/>
-        </w:rPr>
-        <w:t>图 28：在 slub_alloc() 的超范围申请分支处调试。用于验证超过支持上限的对象大小会被拒绝。</w:t>
+        <w:jc w:val="center"/>
+      </w:pPr>
+      <w:r>
+        <w:rPr>
+          <w:rFonts w:ascii="宋体" w:hAnsi="宋体" w:eastAsia="宋体" w:cs="宋体"/>
+          <w:sz w:val="18"/>
+          <w:szCs w:val="18"/>
+        </w:rPr>
+        <w:t>图 34：SLUB 超范围请求</w:t>
       </w:r>
     </w:p>
     <w:p>
@@ -5348,14 +5376,15 @@
     <w:p>
       <w:pPr>
         <w:spacing w:before="0" w:after="80"/>
-      </w:pPr>
-      <w:r>
-        <w:rPr>
-          <w:rFonts w:ascii="宋体" w:hAnsi="宋体" w:eastAsia="宋体" w:cs="宋体"/>
-          <w:sz w:val="21"/>
-          <w:szCs w:val="21"/>
-        </w:rPr>
-        <w:t>图 29：查看超范围请求的调用栈和源码。用于确认该边界条件由 slub_test 调用并沿正确分支返回。</w:t>
+        <w:jc w:val="center"/>
+      </w:pPr>
+      <w:r>
+        <w:rPr>
+          <w:rFonts w:ascii="宋体" w:hAnsi="宋体" w:eastAsia="宋体" w:cs="宋体"/>
+          <w:sz w:val="18"/>
+          <w:szCs w:val="18"/>
+        </w:rPr>
+        <w:t>图 35：size 1025 调用栈</w:t>
       </w:r>
     </w:p>
     <w:p>
@@ -5431,14 +5460,15 @@
     <w:p>
       <w:pPr>
         <w:spacing w:before="0" w:after="80"/>
-      </w:pPr>
-      <w:r>
-        <w:rPr>
-          <w:rFonts w:ascii="宋体" w:hAnsi="宋体" w:eastAsia="宋体" w:cs="宋体"/>
-          <w:sz w:val="21"/>
-          <w:szCs w:val="21"/>
-        </w:rPr>
-        <w:t>图 30：在 slub_alloc() 中查看 size=1025 的参数、调用栈及实现代码。用于验证超范围请求通过 slub_find_cache() 找不到匹配缓存后返回 NULL。</w:t>
+        <w:jc w:val="center"/>
+      </w:pPr>
+      <w:r>
+        <w:rPr>
+          <w:rFonts w:ascii="宋体" w:hAnsi="宋体" w:eastAsia="宋体" w:cs="宋体"/>
+          <w:sz w:val="18"/>
+          <w:szCs w:val="18"/>
+        </w:rPr>
+        <w:t>图 36：size 1025 分配路径</w:t>
       </w:r>
     </w:p>
     <w:p>
@@ -5514,14 +5544,15 @@
     <w:p>
       <w:pPr>
         <w:spacing w:before="0" w:after="80"/>
-      </w:pPr>
-      <w:r>
-        <w:rPr>
-          <w:rFonts w:ascii="宋体" w:hAnsi="宋体" w:eastAsia="宋体" w:cs="宋体"/>
-          <w:sz w:val="21"/>
-          <w:szCs w:val="21"/>
-        </w:rPr>
-        <w:t>图 31：结束 size=1025 的 slub_alloc() 调用并查看返回值。用于验证超出 1024 字节上限时返回 NULL。</w:t>
+        <w:jc w:val="center"/>
+      </w:pPr>
+      <w:r>
+        <w:rPr>
+          <w:rFonts w:ascii="宋体" w:hAnsi="宋体" w:eastAsia="宋体" w:cs="宋体"/>
+          <w:sz w:val="18"/>
+          <w:szCs w:val="18"/>
+        </w:rPr>
+        <w:t>图 37：超范围返回 NULL</w:t>
       </w:r>
     </w:p>
     <w:p>
@@ -5597,14 +5628,15 @@
     <w:p>
       <w:pPr>
         <w:spacing w:before="0" w:after="80"/>
-      </w:pPr>
-      <w:r>
-        <w:rPr>
-          <w:rFonts w:ascii="宋体" w:hAnsi="宋体" w:eastAsia="宋体" w:cs="宋体"/>
-          <w:sz w:val="21"/>
-          <w:szCs w:val="21"/>
-        </w:rPr>
-        <w:t>图 32：在 size=8 时再次命中 slub_alloc()，断点条件限制为 0&lt;size&lt;=1024。用于验证有效对象可进入正常分配分支。</w:t>
+        <w:jc w:val="center"/>
+      </w:pPr>
+      <w:r>
+        <w:rPr>
+          <w:rFonts w:ascii="宋体" w:hAnsi="宋体" w:eastAsia="宋体" w:cs="宋体"/>
+          <w:sz w:val="18"/>
+          <w:szCs w:val="18"/>
+        </w:rPr>
+        <w:t>图 38：size 8 正常请求</w:t>
       </w:r>
     </w:p>
     <w:p>
@@ -5680,14 +5712,15 @@
     <w:p>
       <w:pPr>
         <w:spacing w:before="0" w:after="80"/>
-      </w:pPr>
-      <w:r>
-        <w:rPr>
-          <w:rFonts w:ascii="宋体" w:hAnsi="宋体" w:eastAsia="宋体" w:cs="宋体"/>
-          <w:sz w:val="21"/>
-          <w:szCs w:val="21"/>
-        </w:rPr>
-        <w:t>图 33：查看 size=8 的调用栈和 slub_alloc() 实现。用于检查 slub_find_cache()、slub_new_slab() 和空闲链表取对象的正常分配路径。</w:t>
+        <w:jc w:val="center"/>
+      </w:pPr>
+      <w:r>
+        <w:rPr>
+          <w:rFonts w:ascii="宋体" w:hAnsi="宋体" w:eastAsia="宋体" w:cs="宋体"/>
+          <w:sz w:val="18"/>
+          <w:szCs w:val="18"/>
+        </w:rPr>
+        <w:t>图 39：size 8 分配路径</w:t>
       </w:r>
     </w:p>
     <w:p>
@@ -5763,14 +5796,15 @@
     <w:p>
       <w:pPr>
         <w:spacing w:before="0" w:after="80"/>
-      </w:pPr>
-      <w:r>
-        <w:rPr>
-          <w:rFonts w:ascii="宋体" w:hAnsi="宋体" w:eastAsia="宋体" w:cs="宋体"/>
-          <w:sz w:val="21"/>
-          <w:szCs w:val="21"/>
-        </w:rPr>
-        <w:t>图 34：禁用临时断点并继续执行。用于让边界检查后的 SLUB 测试继续运行，避免调试断点干扰完成状态。</w:t>
+        <w:jc w:val="center"/>
+      </w:pPr>
+      <w:r>
+        <w:rPr>
+          <w:rFonts w:ascii="宋体" w:hAnsi="宋体" w:eastAsia="宋体" w:cs="宋体"/>
+          <w:sz w:val="18"/>
+          <w:szCs w:val="18"/>
+        </w:rPr>
+        <w:t>图 40：继续执行 SLUB 测试</w:t>
       </w:r>
     </w:p>
     <w:p>
@@ -5846,14 +5880,15 @@
     <w:p>
       <w:pPr>
         <w:spacing w:before="0" w:after="80"/>
-      </w:pPr>
-      <w:r>
-        <w:rPr>
-          <w:rFonts w:ascii="宋体" w:hAnsi="宋体" w:eastAsia="宋体" w:cs="宋体"/>
-          <w:sz w:val="21"/>
-          <w:szCs w:val="21"/>
-        </w:rPr>
-        <w:t>图 35：QEMU 串口显示 slub_check() succeeded!。用于验证 SLUB 分配、释放和页回收的自检通过。</w:t>
+        <w:jc w:val="center"/>
+      </w:pPr>
+      <w:r>
+        <w:rPr>
+          <w:rFonts w:ascii="宋体" w:hAnsi="宋体" w:eastAsia="宋体" w:cs="宋体"/>
+          <w:sz w:val="18"/>
+          <w:szCs w:val="18"/>
+        </w:rPr>
+        <w:t>图 41：SLUB 自检通过</w:t>
       </w:r>
     </w:p>
     <w:p>
@@ -5975,14 +6010,15 @@
     <w:p>
       <w:pPr>
         <w:spacing w:before="0" w:after="80"/>
-      </w:pPr>
-      <w:r>
-        <w:rPr>
-          <w:rFonts w:ascii="宋体" w:hAnsi="宋体" w:eastAsia="宋体" w:cs="宋体"/>
-          <w:sz w:val="21"/>
-          <w:szCs w:val="21"/>
-        </w:rPr>
-        <w:t>图 36：启动宿主机 GDB 并为 QEMU 的 riscv_cpu_tlb_fill() 和 get_physical_address() 设置断点。用于进入 TLB 地址翻译调试。</w:t>
+        <w:jc w:val="center"/>
+      </w:pPr>
+      <w:r>
+        <w:rPr>
+          <w:rFonts w:ascii="宋体" w:hAnsi="宋体" w:eastAsia="宋体" w:cs="宋体"/>
+          <w:sz w:val="18"/>
+          <w:szCs w:val="18"/>
+        </w:rPr>
+        <w:t>图 42：QEMU TLB 调试断点</w:t>
       </w:r>
     </w:p>
     <w:p>
@@ -6058,14 +6094,15 @@
     <w:p>
       <w:pPr>
         <w:spacing w:before="0" w:after="80"/>
-      </w:pPr>
-      <w:r>
-        <w:rPr>
-          <w:rFonts w:ascii="宋体" w:hAnsi="宋体" w:eastAsia="宋体" w:cs="宋体"/>
-          <w:sz w:val="21"/>
-          <w:szCs w:val="21"/>
-        </w:rPr>
-        <w:t>图 37：尝试以 RISC-V GDB 连接来宾调试端口时的协议报错。用于记录远程包错误现象，并与后续宿主机 QEMU 调试方案区分。</w:t>
+        <w:jc w:val="center"/>
+      </w:pPr>
+      <w:r>
+        <w:rPr>
+          <w:rFonts w:ascii="宋体" w:hAnsi="宋体" w:eastAsia="宋体" w:cs="宋体"/>
+          <w:sz w:val="18"/>
+          <w:szCs w:val="18"/>
+        </w:rPr>
+        <w:t>图 43：RISC-V GDB 协议错误</w:t>
       </w:r>
     </w:p>
     <w:p>
@@ -6141,14 +6178,15 @@
     <w:p>
       <w:pPr>
         <w:spacing w:before="0" w:after="80"/>
-      </w:pPr>
-      <w:r>
-        <w:rPr>
-          <w:rFonts w:ascii="宋体" w:hAnsi="宋体" w:eastAsia="宋体" w:cs="宋体"/>
-          <w:sz w:val="21"/>
-          <w:szCs w:val="21"/>
-        </w:rPr>
-        <w:t>图 38：在 GDB 中配置 QEMU 启动参数和 TLB 断点时的命令输出。用于记录参数格式错误并为后续正确的 -s -S 启动方式做排查。</w:t>
+        <w:jc w:val="center"/>
+      </w:pPr>
+      <w:r>
+        <w:rPr>
+          <w:rFonts w:ascii="宋体" w:hAnsi="宋体" w:eastAsia="宋体" w:cs="宋体"/>
+          <w:sz w:val="18"/>
+          <w:szCs w:val="18"/>
+        </w:rPr>
+        <w:t>图 44：GDB 参数配置错误</w:t>
       </w:r>
     </w:p>
     <w:p>
@@ -6224,14 +6262,15 @@
     <w:p>
       <w:pPr>
         <w:spacing w:before="0" w:after="80"/>
-      </w:pPr>
-      <w:r>
-        <w:rPr>
-          <w:rFonts w:ascii="宋体" w:hAnsi="宋体" w:eastAsia="宋体" w:cs="宋体"/>
-          <w:sz w:val="21"/>
-          <w:szCs w:val="21"/>
-        </w:rPr>
-        <w:t>图 39：在 RISC-V GDB 中尝试通过 set args 配置 QEMU 参数与 TLB 断点。用于记录“on/off expected”的参数格式错误，说明该步骤需要改用宿主机命令启动 QEMU。</w:t>
+        <w:jc w:val="center"/>
+      </w:pPr>
+      <w:r>
+        <w:rPr>
+          <w:rFonts w:ascii="宋体" w:hAnsi="宋体" w:eastAsia="宋体" w:cs="宋体"/>
+          <w:sz w:val="18"/>
+          <w:szCs w:val="18"/>
+        </w:rPr>
+        <w:t>图 45：set args 错误记录</w:t>
       </w:r>
     </w:p>
     <w:p>
@@ -6311,14 +6350,15 @@
     <w:p>
       <w:pPr>
         <w:spacing w:before="0" w:after="80"/>
-      </w:pPr>
-      <w:r>
-        <w:rPr>
-          <w:rFonts w:ascii="宋体" w:hAnsi="宋体" w:eastAsia="宋体" w:cs="宋体"/>
-          <w:sz w:val="21"/>
-          <w:szCs w:val="21"/>
-        </w:rPr>
-        <w:t>图 40：在宿主机命令行使用 qemu-system-riscv64 的 -s -S 参数启动 QEMU。用于让模拟器暂停并开放远程调试端口。</w:t>
+        <w:jc w:val="center"/>
+      </w:pPr>
+      <w:r>
+        <w:rPr>
+          <w:rFonts w:ascii="宋体" w:hAnsi="宋体" w:eastAsia="宋体" w:cs="宋体"/>
+          <w:sz w:val="18"/>
+          <w:szCs w:val="18"/>
+        </w:rPr>
+        <w:t>图 46：QEMU -s -S 启动</w:t>
       </w:r>
     </w:p>
     <w:p>
@@ -6394,14 +6434,15 @@
     <w:p>
       <w:pPr>
         <w:spacing w:before="0" w:after="80"/>
-      </w:pPr>
-      <w:r>
-        <w:rPr>
-          <w:rFonts w:ascii="宋体" w:hAnsi="宋体" w:eastAsia="宋体" w:cs="宋体"/>
-          <w:sz w:val="21"/>
-          <w:szCs w:val="21"/>
-        </w:rPr>
-        <w:t>图 41：检查 qemu-system-riscv64 进程及 TCP 1234 监听状态。用于确认 QEMU 已运行且 GDB 端口可用。</w:t>
+        <w:jc w:val="center"/>
+      </w:pPr>
+      <w:r>
+        <w:rPr>
+          <w:rFonts w:ascii="宋体" w:hAnsi="宋体" w:eastAsia="宋体" w:cs="宋体"/>
+          <w:sz w:val="18"/>
+          <w:szCs w:val="18"/>
+        </w:rPr>
+        <w:t>图 47：QEMU 进程与端口</w:t>
       </w:r>
     </w:p>
     <w:p>
@@ -6477,14 +6518,15 @@
     <w:p>
       <w:pPr>
         <w:spacing w:before="0" w:after="80"/>
-      </w:pPr>
-      <w:r>
-        <w:rPr>
-          <w:rFonts w:ascii="宋体" w:hAnsi="宋体" w:eastAsia="宋体" w:cs="宋体"/>
-          <w:sz w:val="21"/>
-          <w:szCs w:val="21"/>
-        </w:rPr>
-        <w:t>图 42：查看 VS Code Ports 面板转发 1234 端口。用于确认本机调试端口已暴露到编辑器连接通道。</w:t>
+        <w:jc w:val="center"/>
+      </w:pPr>
+      <w:r>
+        <w:rPr>
+          <w:rFonts w:ascii="宋体" w:hAnsi="宋体" w:eastAsia="宋体" w:cs="宋体"/>
+          <w:sz w:val="18"/>
+          <w:szCs w:val="18"/>
+        </w:rPr>
+        <w:t>图 48：VS Code 端口转发</w:t>
       </w:r>
     </w:p>
     <w:p>
@@ -6560,14 +6602,15 @@
     <w:p>
       <w:pPr>
         <w:spacing w:before="0" w:after="80"/>
-      </w:pPr>
-      <w:r>
-        <w:rPr>
-          <w:rFonts w:ascii="宋体" w:hAnsi="宋体" w:eastAsia="宋体" w:cs="宋体"/>
-          <w:sz w:val="21"/>
-          <w:szCs w:val="21"/>
-        </w:rPr>
-        <w:t>图 43：宿主机 GDB 附加到 qemu-system-riscv64 进程。用于观察 QEMU 内部 RISC-V TLB 处理函数的执行位置。</w:t>
+        <w:jc w:val="center"/>
+      </w:pPr>
+      <w:r>
+        <w:rPr>
+          <w:rFonts w:ascii="宋体" w:hAnsi="宋体" w:eastAsia="宋体" w:cs="宋体"/>
+          <w:sz w:val="18"/>
+          <w:szCs w:val="18"/>
+        </w:rPr>
+        <w:t>图 49：宿主机 GDB 附加 QEMU</w:t>
       </w:r>
     </w:p>
     <w:p>
@@ -6643,14 +6686,15 @@
     <w:p>
       <w:pPr>
         <w:spacing w:before="0" w:after="80"/>
-      </w:pPr>
-      <w:r>
-        <w:rPr>
-          <w:rFonts w:ascii="宋体" w:hAnsi="宋体" w:eastAsia="宋体" w:cs="宋体"/>
-          <w:sz w:val="21"/>
-          <w:szCs w:val="21"/>
-        </w:rPr>
-        <w:t>图 44：RISC-V GDB 连接内核、设置 kern_init() 断点并命中。用于建立来宾内核地址转换调试的起始状态。</w:t>
+        <w:jc w:val="center"/>
+      </w:pPr>
+      <w:r>
+        <w:rPr>
+          <w:rFonts w:ascii="宋体" w:hAnsi="宋体" w:eastAsia="宋体" w:cs="宋体"/>
+          <w:sz w:val="18"/>
+          <w:szCs w:val="18"/>
+        </w:rPr>
+        <w:t>图 50：来宾 GDB kern_init 断点</w:t>
       </w:r>
     </w:p>
     <w:p>
@@ -6726,14 +6770,15 @@
     <w:p>
       <w:pPr>
         <w:spacing w:before="0" w:after="80"/>
-      </w:pPr>
-      <w:r>
-        <w:rPr>
-          <w:rFonts w:ascii="宋体" w:hAnsi="宋体" w:eastAsia="宋体" w:cs="宋体"/>
-          <w:sz w:val="21"/>
-          <w:szCs w:val="21"/>
-        </w:rPr>
-        <w:t>图 45：在 kern_init() 处读取 PC 与 satp。用于记录 Sv39 地址转换开始时的内核入口地址和页表根寄存器。</w:t>
+        <w:jc w:val="center"/>
+      </w:pPr>
+      <w:r>
+        <w:rPr>
+          <w:rFonts w:ascii="宋体" w:hAnsi="宋体" w:eastAsia="宋体" w:cs="宋体"/>
+          <w:sz w:val="18"/>
+          <w:szCs w:val="18"/>
+        </w:rPr>
+        <w:t>图 51：来宾 PC 与 satp</w:t>
       </w:r>
     </w:p>
     <w:p>
@@ -6809,14 +6854,15 @@
     <w:p>
       <w:pPr>
         <w:spacing w:before="0" w:after="80"/>
-      </w:pPr>
-      <w:r>
-        <w:rPr>
-          <w:rFonts w:ascii="宋体" w:hAnsi="宋体" w:eastAsia="宋体" w:cs="宋体"/>
-          <w:sz w:val="21"/>
-          <w:szCs w:val="21"/>
-        </w:rPr>
-        <w:t>图 46：QEMU 以 -s -S 启动后的串口输出。用于观察调试会话恢复执行时的固件和内核启动状态。</w:t>
+        <w:jc w:val="center"/>
+      </w:pPr>
+      <w:r>
+        <w:rPr>
+          <w:rFonts w:ascii="宋体" w:hAnsi="宋体" w:eastAsia="宋体" w:cs="宋体"/>
+          <w:sz w:val="18"/>
+          <w:szCs w:val="18"/>
+        </w:rPr>
+        <w:t>图 52：QEMU 恢复启动</w:t>
       </w:r>
     </w:p>
     <w:p>
@@ -6892,14 +6938,15 @@
     <w:p>
       <w:pPr>
         <w:spacing w:before="0" w:after="80"/>
-      </w:pPr>
-      <w:r>
-        <w:rPr>
-          <w:rFonts w:ascii="宋体" w:hAnsi="宋体" w:eastAsia="宋体" w:cs="宋体"/>
-          <w:sz w:val="21"/>
-          <w:szCs w:val="21"/>
-        </w:rPr>
-        <w:t>图 47：在宿主机 GDB 中继续执行、接收 SIGINT 并设置 TLB 相关断点。用于准备跟踪 get_physical_address() 的地址翻译过程。</w:t>
+        <w:jc w:val="center"/>
+      </w:pPr>
+      <w:r>
+        <w:rPr>
+          <w:rFonts w:ascii="宋体" w:hAnsi="宋体" w:eastAsia="宋体" w:cs="宋体"/>
+          <w:sz w:val="18"/>
+          <w:szCs w:val="18"/>
+        </w:rPr>
+        <w:t>图 53：宿主机 TLB 断点</w:t>
       </w:r>
     </w:p>
     <w:p>
@@ -6975,14 +7022,15 @@
     <w:p>
       <w:pPr>
         <w:spacing w:before="0" w:after="80"/>
-      </w:pPr>
-      <w:r>
-        <w:rPr>
-          <w:rFonts w:ascii="宋体" w:hAnsi="宋体" w:eastAsia="宋体" w:cs="宋体"/>
-          <w:sz w:val="21"/>
-          <w:szCs w:val="21"/>
-        </w:rPr>
-        <w:t>图 48：在来宾 GDB 中继续执行。用于触发后续内存访问并等待 TLB 相关断点命中。</w:t>
+        <w:jc w:val="center"/>
+      </w:pPr>
+      <w:r>
+        <w:rPr>
+          <w:rFonts w:ascii="宋体" w:hAnsi="宋体" w:eastAsia="宋体" w:cs="宋体"/>
+          <w:sz w:val="18"/>
+          <w:szCs w:val="18"/>
+        </w:rPr>
+        <w:t>图 54：来宾触发内存访问</w:t>
       </w:r>
     </w:p>
     <w:p>
@@ -7058,14 +7106,15 @@
     <w:p>
       <w:pPr>
         <w:spacing w:before="0" w:after="80"/>
-      </w:pPr>
-      <w:r>
-        <w:rPr>
-          <w:rFonts w:ascii="宋体" w:hAnsi="宋体" w:eastAsia="宋体" w:cs="宋体"/>
-          <w:sz w:val="21"/>
-          <w:szCs w:val="21"/>
-        </w:rPr>
-        <w:t>图 49：运行中断后停在 kern_init()。用于记录来宾停止位置，确认可由 GDB 控制内核执行。</w:t>
+        <w:jc w:val="center"/>
+      </w:pPr>
+      <w:r>
+        <w:rPr>
+          <w:rFonts w:ascii="宋体" w:hAnsi="宋体" w:eastAsia="宋体" w:cs="宋体"/>
+          <w:sz w:val="18"/>
+          <w:szCs w:val="18"/>
+        </w:rPr>
+        <w:t>图 55：来宾中断位置</w:t>
       </w:r>
     </w:p>
     <w:p>
@@ -7141,14 +7190,15 @@
     <w:p>
       <w:pPr>
         <w:spacing w:before="0" w:after="80"/>
-      </w:pPr>
-      <w:r>
-        <w:rPr>
-          <w:rFonts w:ascii="宋体" w:hAnsi="宋体" w:eastAsia="宋体" w:cs="宋体"/>
-          <w:sz w:val="21"/>
-          <w:szCs w:val="21"/>
-        </w:rPr>
-        <w:t>图 50：宿主机 GDB 命中 QEMU 的 get_physical_address() 断点。用于确认来宾访问触发了 QEMU 的地址翻译处理。</w:t>
+        <w:jc w:val="center"/>
+      </w:pPr>
+      <w:r>
+        <w:rPr>
+          <w:rFonts w:ascii="宋体" w:hAnsi="宋体" w:eastAsia="宋体" w:cs="宋体"/>
+          <w:sz w:val="18"/>
+          <w:szCs w:val="18"/>
+        </w:rPr>
+        <w:t>图 56：get_physical_address 断点</w:t>
       </w:r>
     </w:p>
     <w:p>
@@ -7224,14 +7274,15 @@
     <w:p>
       <w:pPr>
         <w:spacing w:before="0" w:after="80"/>
-      </w:pPr>
-      <w:r>
-        <w:rPr>
-          <w:rFonts w:ascii="宋体" w:hAnsi="宋体" w:eastAsia="宋体" w:cs="宋体"/>
-          <w:sz w:val="21"/>
-          <w:szCs w:val="21"/>
-        </w:rPr>
-        <w:t>图 51：查看 get_physical_address() 的参数、局部信息和调用栈。用于记录虚拟地址、访问类型及 QEMU 翻译函数的调用上下文。</w:t>
+        <w:jc w:val="center"/>
+      </w:pPr>
+      <w:r>
+        <w:rPr>
+          <w:rFonts w:ascii="宋体" w:hAnsi="宋体" w:eastAsia="宋体" w:cs="宋体"/>
+          <w:sz w:val="18"/>
+          <w:szCs w:val="18"/>
+        </w:rPr>
+        <w:t>图 57：地址翻译函数调用栈</w:t>
       </w:r>
     </w:p>
     <w:p>
@@ -7307,14 +7358,15 @@
     <w:p>
       <w:pPr>
         <w:spacing w:before="0" w:after="80"/>
-      </w:pPr>
-      <w:r>
-        <w:rPr>
-          <w:rFonts w:ascii="宋体" w:hAnsi="宋体" w:eastAsia="宋体" w:cs="宋体"/>
-          <w:sz w:val="21"/>
-          <w:szCs w:val="21"/>
-        </w:rPr>
-        <w:t>图 52：查看 QEMU 中 get_physical_address() 的 MMU 模式、satp 和页表层级计算源码。用于解释地址翻译前的模式选择与根页表基址计算。</w:t>
+        <w:jc w:val="center"/>
+      </w:pPr>
+      <w:r>
+        <w:rPr>
+          <w:rFonts w:ascii="宋体" w:hAnsi="宋体" w:eastAsia="宋体" w:cs="宋体"/>
+          <w:sz w:val="18"/>
+          <w:szCs w:val="18"/>
+        </w:rPr>
+        <w:t>图 58：地址翻译源码</w:t>
       </w:r>
     </w:p>
     <w:p>
@@ -7390,14 +7442,15 @@
     <w:p>
       <w:pPr>
         <w:spacing w:before="0" w:after="80"/>
-      </w:pPr>
-      <w:r>
-        <w:rPr>
-          <w:rFonts w:ascii="宋体" w:hAnsi="宋体" w:eastAsia="宋体" w:cs="宋体"/>
-          <w:sz w:val="21"/>
-          <w:szCs w:val="21"/>
-        </w:rPr>
-        <w:t>图 53：读取 env-&gt;satp 派生的页表根地址、检查断点列表后继续执行。用于确认地址翻译观察点已经配置完成。</w:t>
+        <w:jc w:val="center"/>
+      </w:pPr>
+      <w:r>
+        <w:rPr>
+          <w:rFonts w:ascii="宋体" w:hAnsi="宋体" w:eastAsia="宋体" w:cs="宋体"/>
+          <w:sz w:val="18"/>
+          <w:szCs w:val="18"/>
+        </w:rPr>
+        <w:t>图 59：根页表地址</w:t>
       </w:r>
     </w:p>
     <w:p>
@@ -7473,14 +7526,15 @@
     <w:p>
       <w:pPr>
         <w:spacing w:before="0" w:after="80"/>
-      </w:pPr>
-      <w:r>
-        <w:rPr>
-          <w:rFonts w:ascii="宋体" w:hAnsi="宋体" w:eastAsia="宋体" w:cs="宋体"/>
-          <w:sz w:val="21"/>
-          <w:szCs w:val="21"/>
-        </w:rPr>
-        <w:t>图 54：显示 riscv_cpu_tlb_fill() 命中时的目标地址和访问类型。用于记录本次 TLB 填充的实际调用参数。</w:t>
+        <w:jc w:val="center"/>
+      </w:pPr>
+      <w:r>
+        <w:rPr>
+          <w:rFonts w:ascii="宋体" w:hAnsi="宋体" w:eastAsia="宋体" w:cs="宋体"/>
+          <w:sz w:val="18"/>
+          <w:szCs w:val="18"/>
+        </w:rPr>
+        <w:t>图 60：riscv_cpu_tlb_fill 命中</w:t>
       </w:r>
     </w:p>
     <w:p>
@@ -7556,14 +7610,15 @@
     <w:p>
       <w:pPr>
         <w:spacing w:before="0" w:after="80"/>
-      </w:pPr>
-      <w:r>
-        <w:rPr>
-          <w:rFonts w:ascii="宋体" w:hAnsi="宋体" w:eastAsia="宋体" w:cs="宋体"/>
-          <w:sz w:val="21"/>
-          <w:szCs w:val="21"/>
-        </w:rPr>
-        <w:t>图 55：查看 get_physical_address() 的参数与调用栈。用于记录页表遍历时的虚拟地址、访问大小和翻译上下文。</w:t>
+        <w:jc w:val="center"/>
+      </w:pPr>
+      <w:r>
+        <w:rPr>
+          <w:rFonts w:ascii="宋体" w:hAnsi="宋体" w:eastAsia="宋体" w:cs="宋体"/>
+          <w:sz w:val="18"/>
+          <w:szCs w:val="18"/>
+        </w:rPr>
+        <w:t>图 61：地址翻译参数与调用栈</w:t>
       </w:r>
     </w:p>
     <w:p>
@@ -7639,14 +7694,15 @@
     <w:p>
       <w:pPr>
         <w:spacing w:before="0" w:after="80"/>
-      </w:pPr>
-      <w:r>
-        <w:rPr>
-          <w:rFonts w:ascii="宋体" w:hAnsi="宋体" w:eastAsia="宋体" w:cs="宋体"/>
-          <w:sz w:val="21"/>
-          <w:szCs w:val="21"/>
-        </w:rPr>
-        <w:t>图 56：查看 riscv_cpu_tlb_fill() 中调用 get_physical_address()、处理返回码并调用 tlb_set_page() 的源码。用于说明 TLB 映射建立的控制流程。</w:t>
+        <w:jc w:val="center"/>
+      </w:pPr>
+      <w:r>
+        <w:rPr>
+          <w:rFonts w:ascii="宋体" w:hAnsi="宋体" w:eastAsia="宋体" w:cs="宋体"/>
+          <w:sz w:val="18"/>
+          <w:szCs w:val="18"/>
+        </w:rPr>
+        <w:t>图 62：TLB 映射源码</w:t>
       </w:r>
     </w:p>
     <w:p>
@@ -7722,14 +7778,15 @@
     <w:p>
       <w:pPr>
         <w:spacing w:before="0" w:after="80"/>
-      </w:pPr>
-      <w:r>
-        <w:rPr>
-          <w:rFonts w:ascii="宋体" w:hAnsi="宋体" w:eastAsia="宋体" w:cs="宋体"/>
-          <w:sz w:val="21"/>
-          <w:szCs w:val="21"/>
-        </w:rPr>
-        <w:t>图 57：查看 get_physical_address() 的逐级页表遍历源码，并在 PTE 地址计算处设置断点。用于观察 PTE 读取和页表步进。</w:t>
+        <w:jc w:val="center"/>
+      </w:pPr>
+      <w:r>
+        <w:rPr>
+          <w:rFonts w:ascii="宋体" w:hAnsi="宋体" w:eastAsia="宋体" w:cs="宋体"/>
+          <w:sz w:val="18"/>
+          <w:szCs w:val="18"/>
+        </w:rPr>
+        <w:t>图 63：页表遍历源码</w:t>
       </w:r>
     </w:p>
     <w:p>
@@ -7805,14 +7862,15 @@
     <w:p>
       <w:pPr>
         <w:spacing w:before="0" w:after="80"/>
-      </w:pPr>
-      <w:r>
-        <w:rPr>
-          <w:rFonts w:ascii="宋体" w:hAnsi="宋体" w:eastAsia="宋体" w:cs="宋体"/>
-          <w:sz w:val="21"/>
-          <w:szCs w:val="21"/>
-        </w:rPr>
-        <w:t>图 58：读取页表遍历变量 i、levels、base、idx、pte_addr 和 pte。用于验证当前虚拟地址的索引计算和页表项内容。</w:t>
+        <w:jc w:val="center"/>
+      </w:pPr>
+      <w:r>
+        <w:rPr>
+          <w:rFonts w:ascii="宋体" w:hAnsi="宋体" w:eastAsia="宋体" w:cs="宋体"/>
+          <w:sz w:val="18"/>
+          <w:szCs w:val="18"/>
+        </w:rPr>
+        <w:t>图 64：PTE 与页表变量</w:t>
       </w:r>
     </w:p>
     <w:p>
@@ -7888,14 +7946,15 @@
     <w:p>
       <w:pPr>
         <w:spacing w:before="0" w:after="80"/>
-      </w:pPr>
-      <w:r>
-        <w:rPr>
-          <w:rFonts w:ascii="宋体" w:hAnsi="宋体" w:eastAsia="宋体" w:cs="宋体"/>
-          <w:sz w:val="21"/>
-          <w:szCs w:val="21"/>
-        </w:rPr>
-        <w:t>图 59：检查 PTE 标志位并从 get_physical_address() 返回。用于观察一次页表翻译的中间计算结果和返回路径。</w:t>
+        <w:jc w:val="center"/>
+      </w:pPr>
+      <w:r>
+        <w:rPr>
+          <w:rFonts w:ascii="宋体" w:hAnsi="宋体" w:eastAsia="宋体" w:cs="宋体"/>
+          <w:sz w:val="18"/>
+          <w:szCs w:val="18"/>
+        </w:rPr>
+        <w:t>图 65：PTE 检查与函数返回</w:t>
       </w:r>
     </w:p>
     <w:p>
@@ -7971,14 +8030,15 @@
     <w:p>
       <w:pPr>
         <w:spacing w:before="0" w:after="80"/>
-      </w:pPr>
-      <w:r>
-        <w:rPr>
-          <w:rFonts w:ascii="宋体" w:hAnsi="宋体" w:eastAsia="宋体" w:cs="宋体"/>
-          <w:sz w:val="21"/>
-          <w:szCs w:val="21"/>
-        </w:rPr>
-        <w:t>图 60：查看传入 tlb_set_page() 前的地址、权限和调用栈。用于核对 TLB 映射建立所使用的虚拟地址和物理地址。</w:t>
+        <w:jc w:val="center"/>
+      </w:pPr>
+      <w:r>
+        <w:rPr>
+          <w:rFonts w:ascii="宋体" w:hAnsi="宋体" w:eastAsia="宋体" w:cs="宋体"/>
+          <w:sz w:val="18"/>
+          <w:szCs w:val="18"/>
+        </w:rPr>
+        <w:t>图 66：tlb_set_page 调用前状态</w:t>
       </w:r>
     </w:p>
     <w:p>
@@ -8054,14 +8114,15 @@
     <w:p>
       <w:pPr>
         <w:spacing w:before="0" w:after="80"/>
-      </w:pPr>
-      <w:r>
-        <w:rPr>
-          <w:rFonts w:ascii="宋体" w:hAnsi="宋体" w:eastAsia="宋体" w:cs="宋体"/>
-          <w:sz w:val="21"/>
-          <w:szCs w:val="21"/>
-        </w:rPr>
-        <w:t>图 61：单步进入 tlb_set_page() 并查看参数。用于检查写入 TLB 时的 vaddr、paddr、prot、mmu_idx 和 page size。</w:t>
+        <w:jc w:val="center"/>
+      </w:pPr>
+      <w:r>
+        <w:rPr>
+          <w:rFonts w:ascii="宋体" w:hAnsi="宋体" w:eastAsia="宋体" w:cs="宋体"/>
+          <w:sz w:val="18"/>
+          <w:szCs w:val="18"/>
+        </w:rPr>
+        <w:t>图 67：tlb_set_page 参数</w:t>
       </w:r>
     </w:p>
     <w:p>
@@ -8137,14 +8198,15 @@
     <w:p>
       <w:pPr>
         <w:spacing w:before="0" w:after="80"/>
-      </w:pPr>
-      <w:r>
-        <w:rPr>
-          <w:rFonts w:ascii="宋体" w:hAnsi="宋体" w:eastAsia="宋体" w:cs="宋体"/>
-          <w:sz w:val="21"/>
-          <w:szCs w:val="21"/>
-        </w:rPr>
-        <w:t>图 62：继续查看 tlb_set_page() 内的参数和调用关系。用于确认已得到的翻译结果被交给 QEMU TLB 子系统。</w:t>
+        <w:jc w:val="center"/>
+      </w:pPr>
+      <w:r>
+        <w:rPr>
+          <w:rFonts w:ascii="宋体" w:hAnsi="宋体" w:eastAsia="宋体" w:cs="宋体"/>
+          <w:sz w:val="18"/>
+          <w:szCs w:val="18"/>
+        </w:rPr>
+        <w:t>图 68：tlb_set_page 调用关系</w:t>
       </w:r>
     </w:p>
     <w:p>
@@ -8226,14 +8288,15 @@
     <w:p>
       <w:pPr>
         <w:spacing w:before="0" w:after="80"/>
-      </w:pPr>
-      <w:r>
-        <w:rPr>
-          <w:rFonts w:ascii="宋体" w:hAnsi="宋体" w:eastAsia="宋体" w:cs="宋体"/>
-          <w:sz w:val="21"/>
-          <w:szCs w:val="21"/>
-        </w:rPr>
-        <w:t>图 63：从 riscv_cpu_tlb_fill() 结束当前调用并查看返回值 false。用于记录这次访问的翻译结果，避免将调试现场误判为成功映射。</w:t>
+        <w:jc w:val="center"/>
+      </w:pPr>
+      <w:r>
+        <w:rPr>
+          <w:rFonts w:ascii="宋体" w:hAnsi="宋体" w:eastAsia="宋体" w:cs="宋体"/>
+          <w:sz w:val="18"/>
+          <w:szCs w:val="18"/>
+        </w:rPr>
+        <w:t>图 69：riscv_cpu_tlb_fill 返回值</w:t>
       </w:r>
     </w:p>
     <w:sectPr>

</xml_diff>